<commit_message>
Spring 2027: special topics on exam days, not tested
Moves the three special topics into the lecture slot on the days of Exams
1-3 (Jellyfish I, Axolotl, Songbirds I). Exams again cover exactly ten
lectures each; the syllabus says special topics are not on any exam.
Adjusts Lab 7 and Lab 10 topics so every lab follows its lectures.

Co-Authored-By: Claude Opus 5.5 <noreply@anthropic.com>
Claude-Session: https://claude.ai/code/session_01S5BVrJgavhovAJWstdpyvb
</commit_message>
<xml_diff>
--- a/docs/spring-2027/files/NEUR411_Syllabus_Spring2027.docx
+++ b/docs/spring-2027/files/NEUR411_Syllabus_Spring2027.docx
@@ -2649,7 +2649,7 @@
                 <w:szCs w:val="17"/>
                 <w:rtl w:val="0"/>
               </w:rPr>
-              <w:t>Exam 2 (Lectures 11 to 20 and Special Topic 1)</w:t>
+              <w:t xml:space="preserve">Exam 2 (Lectures 11 to 20)</w:t>
             </w:r>
             <w:r>
               <w:rPr>
@@ -2739,7 +2739,7 @@
                 <w:szCs w:val="17"/>
                 <w:rtl w:val="0"/>
               </w:rPr>
-              <w:t>Exam 3 (Lectures 21 to 30 and Special Topic 2)</w:t>
+              <w:t xml:space="preserve">Exam 3 (Lectures 21 to 30)</w:t>
             </w:r>
             <w:r>
               <w:rPr>
@@ -2829,7 +2829,7 @@
                 <w:szCs w:val="17"/>
                 <w:rtl w:val="0"/>
               </w:rPr>
-              <w:t>Exam 4 (Lectures 31 to 40 and Special Topic 3)</w:t>
+              <w:t xml:space="preserve">Exam 4 (Lectures 31 to 40)</w:t>
             </w:r>
             <w:r>
               <w:rPr>
@@ -4368,7 +4368,7 @@
         <w:rPr>
           <w:rtl w:val="0"/>
         </w:rPr>
-        <w:t>There are four exams, each worth 120 points, and each covers ten lectures; Exams 2, 3, and 4 also cover one special topic. Exam 1 covers Lectures 1 to 10, Exam 2 covers Lectures 11 to 20 and Special Topic 1, Exam 3 covers Lectures 21 to 30 and Special Topic 2, and Exam 4 covers Lectures 31 to 40 and Special Topic 3. Exams are not cumulative, but the concepts build on one another, so later exams will assume you still know earlier material. Exams are given on Mondays at 12:00 PM in NEU 100A or NEU 100B, and they start on time. Exam 4 is given during the final examination period.</w:t>
+        <w:t>There are four exams, each worth 120 points, and each covers exactly ten lectures. Exam 1 covers Lectures 1 to 10, Exam 2 covers Lectures 11 to 20, Exam 3 covers Lectures 21 to 30, and Exam 4 covers Lectures 31 to 40. Exams are not cumulative, but the concepts build on one another, so later exams will assume you still know earlier material. Exams are given on Mondays at 12:00 PM in NEU 100A or NEU 100B, and they start on time. Exam 4 is given during the final examination period. On the days of Exams 1, 2, and 3, the lecture is a special topic; special topics are not covered on any exam.</w:t>
       </w:r>
     </w:p>
     <w:p>
@@ -6415,7 +6415,7 @@
                 <w:szCs w:val="17"/>
                 <w:rtl w:val="0"/>
               </w:rPr>
-              <w:t>Weakly electric fish: electric organ discharge recordings and the jamming avoidance response</w:t>
+              <w:t>Weakly electric fish: electric organ discharge recordings and active electrolocation</w:t>
             </w:r>
             <w:r>
               <w:rPr>
@@ -6779,7 +6779,7 @@
                 <w:szCs w:val="17"/>
                 <w:rtl w:val="0"/>
               </w:rPr>
-              <w:t>Song learning: tutor–pupil song similarity in zebra finches</w:t>
+              <w:t>Songbird song structure: syllable segmentation and song stereotypy in zebra finch recordings</w:t>
             </w:r>
             <w:r>
               <w:rPr>
@@ -10556,6 +10556,7 @@
         </w:trPr>
         <w:tc>
           <w:tcPr>
+            <w:shd w:fill="fafafa" w:val="clear"/>
             <w:tcMar>
               <w:top w:w="50.0" w:type="dxa"/>
               <w:left w:w="80.0" w:type="dxa"/>
@@ -10584,78 +10585,82 @@
         </w:tc>
         <w:tc>
           <w:tcPr>
-            <w:tcMar>
-              <w:top w:w="50.0" w:type="dxa"/>
-              <w:left w:w="80.0" w:type="dxa"/>
-              <w:bottom w:w="50.0" w:type="dxa"/>
-              <w:right w:w="80.0" w:type="dxa"/>
-            </w:tcMar>
-          </w:tcPr>
-          <w:p>
-            <w:pPr>
-              <w:rPr/>
-            </w:pPr>
-            <w:r>
-              <w:rPr>
-                <w:sz w:val="17"/>
-                <w:szCs w:val="17"/>
-                <w:rtl w:val="0"/>
-              </w:rPr>
-              <w:t>Lecture 12</w:t>
-            </w:r>
-            <w:r>
-              <w:rPr>
-                <w:rtl w:val="0"/>
-              </w:rPr>
-            </w:r>
-          </w:p>
-        </w:tc>
-        <w:tc>
-          <w:tcPr>
-            <w:tcMar>
-              <w:top w:w="50.0" w:type="dxa"/>
-              <w:left w:w="80.0" w:type="dxa"/>
-              <w:bottom w:w="50.0" w:type="dxa"/>
-              <w:right w:w="80.0" w:type="dxa"/>
-            </w:tcMar>
-          </w:tcPr>
-          <w:p>
-            <w:pPr>
-              <w:rPr/>
-            </w:pPr>
-            <w:r>
-              <w:rPr>
-                <w:sz w:val="17"/>
-                <w:szCs w:val="17"/>
-                <w:rtl w:val="0"/>
-              </w:rPr>
-              <w:t xml:space="preserve">Insect vision II: jumping spider eyes and predatory tracking (Land)</w:t>
-            </w:r>
-            <w:r>
-              <w:rPr>
-                <w:rtl w:val="0"/>
-              </w:rPr>
-            </w:r>
-          </w:p>
-        </w:tc>
-        <w:tc>
-          <w:tcPr>
-            <w:tcMar>
-              <w:top w:w="50.0" w:type="dxa"/>
-              <w:left w:w="80.0" w:type="dxa"/>
-              <w:bottom w:w="50.0" w:type="dxa"/>
-              <w:right w:w="80.0" w:type="dxa"/>
-            </w:tcMar>
-          </w:tcPr>
-          <w:p>
-            <w:pPr>
-              <w:rPr/>
-            </w:pPr>
-            <w:r>
-              <w:rPr>
-                <w:sz w:val="17"/>
-                <w:rtl w:val="0"/>
-              </w:rPr>
+            <w:shd w:fill="fafafa" w:val="clear"/>
+            <w:tcMar>
+              <w:top w:w="50.0" w:type="dxa"/>
+              <w:left w:w="80.0" w:type="dxa"/>
+              <w:bottom w:w="50.0" w:type="dxa"/>
+              <w:right w:w="80.0" w:type="dxa"/>
+            </w:tcMar>
+          </w:tcPr>
+          <w:p>
+            <w:pPr>
+              <w:rPr/>
+            </w:pPr>
+            <w:r>
+              <w:rPr>
+                <w:sz w:val="17"/>
+                <w:szCs w:val="17"/>
+                <w:rtl w:val="0"/>
+              </w:rPr>
+              <w:t>Special Topic 1</w:t>
+            </w:r>
+            <w:r>
+              <w:rPr>
+                <w:rtl w:val="0"/>
+              </w:rPr>
+            </w:r>
+          </w:p>
+        </w:tc>
+        <w:tc>
+          <w:tcPr>
+            <w:shd w:fill="fafafa" w:val="clear"/>
+            <w:tcMar>
+              <w:top w:w="50.0" w:type="dxa"/>
+              <w:left w:w="80.0" w:type="dxa"/>
+              <w:bottom w:w="50.0" w:type="dxa"/>
+              <w:right w:w="80.0" w:type="dxa"/>
+            </w:tcMar>
+          </w:tcPr>
+          <w:p>
+            <w:pPr>
+              <w:rPr/>
+            </w:pPr>
+            <w:r>
+              <w:rPr>
+                <w:sz w:val="17"/>
+                <w:szCs w:val="17"/>
+                <w:rtl w:val="0"/>
+              </w:rPr>
+              <w:t>Jellyfish I: neuroanatomy of Cassiopea, distributed nerve nets, rhopalia, and pacemaker control of rhythmic bell contractions</w:t>
+            </w:r>
+            <w:r>
+              <w:rPr>
+                <w:rtl w:val="0"/>
+              </w:rPr>
+            </w:r>
+          </w:p>
+        </w:tc>
+        <w:tc>
+          <w:tcPr>
+            <w:shd w:fill="fafafa" w:val="clear"/>
+            <w:tcMar>
+              <w:top w:w="50.0" w:type="dxa"/>
+              <w:left w:w="80.0" w:type="dxa"/>
+              <w:bottom w:w="50.0" w:type="dxa"/>
+              <w:right w:w="80.0" w:type="dxa"/>
+            </w:tcMar>
+          </w:tcPr>
+          <w:p>
+            <w:pPr>
+              <w:rPr/>
+            </w:pPr>
+            <w:r>
+              <w:rPr>
+                <w:sz w:val="17"/>
+                <w:rtl w:val="0"/>
+              </w:rPr>
+              <w:t>Not on the exam</w:t>
             </w:r>
           </w:p>
         </w:tc>
@@ -10863,35 +10868,35 @@
                 <w:szCs w:val="17"/>
                 <w:rtl w:val="0"/>
               </w:rPr>
-              <w:t>Lecture 13</w:t>
-            </w:r>
-            <w:r>
-              <w:rPr>
-                <w:rtl w:val="0"/>
-              </w:rPr>
-            </w:r>
-          </w:p>
-        </w:tc>
-        <w:tc>
-          <w:tcPr>
-            <w:tcMar>
-              <w:top w:w="50.0" w:type="dxa"/>
-              <w:left w:w="80.0" w:type="dxa"/>
-              <w:bottom w:w="50.0" w:type="dxa"/>
-              <w:right w:w="80.0" w:type="dxa"/>
-            </w:tcMar>
-          </w:tcPr>
-          <w:p>
-            <w:pPr>
-              <w:rPr/>
-            </w:pPr>
-            <w:r>
-              <w:rPr>
-                <w:sz w:val="17"/>
-                <w:szCs w:val="17"/>
-                <w:rtl w:val="0"/>
-              </w:rPr>
-              <w:t xml:space="preserve">Mantis shrimp vision: hyperspectral and polarization sensing</w:t>
+              <w:t>Lecture 12</w:t>
+            </w:r>
+            <w:r>
+              <w:rPr>
+                <w:rtl w:val="0"/>
+              </w:rPr>
+            </w:r>
+          </w:p>
+        </w:tc>
+        <w:tc>
+          <w:tcPr>
+            <w:tcMar>
+              <w:top w:w="50.0" w:type="dxa"/>
+              <w:left w:w="80.0" w:type="dxa"/>
+              <w:bottom w:w="50.0" w:type="dxa"/>
+              <w:right w:w="80.0" w:type="dxa"/>
+            </w:tcMar>
+          </w:tcPr>
+          <w:p>
+            <w:pPr>
+              <w:rPr/>
+            </w:pPr>
+            <w:r>
+              <w:rPr>
+                <w:sz w:val="17"/>
+                <w:szCs w:val="17"/>
+                <w:rtl w:val="0"/>
+              </w:rPr>
+              <w:t xml:space="preserve">Insect vision II: jumping spider eyes and predatory tracking (Land)</w:t>
             </w:r>
             <w:r>
               <w:rPr>
@@ -10974,35 +10979,35 @@
                 <w:szCs w:val="17"/>
                 <w:rtl w:val="0"/>
               </w:rPr>
-              <w:t>Lecture 14</w:t>
-            </w:r>
-            <w:r>
-              <w:rPr>
-                <w:rtl w:val="0"/>
-              </w:rPr>
-            </w:r>
-          </w:p>
-        </w:tc>
-        <w:tc>
-          <w:tcPr>
-            <w:tcMar>
-              <w:top w:w="50.0" w:type="dxa"/>
-              <w:left w:w="80.0" w:type="dxa"/>
-              <w:bottom w:w="50.0" w:type="dxa"/>
-              <w:right w:w="80.0" w:type="dxa"/>
-            </w:tcMar>
-          </w:tcPr>
-          <w:p>
-            <w:pPr>
-              <w:rPr/>
-            </w:pPr>
-            <w:r>
-              <w:rPr>
-                <w:sz w:val="17"/>
-                <w:szCs w:val="17"/>
-                <w:rtl w:val="0"/>
-              </w:rPr>
-              <w:t xml:space="preserve">Insect hearing I: cricket phonotaxis and song recognition (Hoy)</w:t>
+              <w:t>Lecture 13</w:t>
+            </w:r>
+            <w:r>
+              <w:rPr>
+                <w:rtl w:val="0"/>
+              </w:rPr>
+            </w:r>
+          </w:p>
+        </w:tc>
+        <w:tc>
+          <w:tcPr>
+            <w:tcMar>
+              <w:top w:w="50.0" w:type="dxa"/>
+              <w:left w:w="80.0" w:type="dxa"/>
+              <w:bottom w:w="50.0" w:type="dxa"/>
+              <w:right w:w="80.0" w:type="dxa"/>
+            </w:tcMar>
+          </w:tcPr>
+          <w:p>
+            <w:pPr>
+              <w:rPr/>
+            </w:pPr>
+            <w:r>
+              <w:rPr>
+                <w:sz w:val="17"/>
+                <w:szCs w:val="17"/>
+                <w:rtl w:val="0"/>
+              </w:rPr>
+              <w:t xml:space="preserve">Mantis shrimp vision: hyperspectral and polarization sensing</w:t>
             </w:r>
             <w:r>
               <w:rPr>
@@ -11446,35 +11451,35 @@
                 <w:szCs w:val="17"/>
                 <w:rtl w:val="0"/>
               </w:rPr>
-              <w:t>Lecture 15</w:t>
-            </w:r>
-            <w:r>
-              <w:rPr>
-                <w:rtl w:val="0"/>
-              </w:rPr>
-            </w:r>
-          </w:p>
-        </w:tc>
-        <w:tc>
-          <w:tcPr>
-            <w:tcMar>
-              <w:top w:w="50.0" w:type="dxa"/>
-              <w:left w:w="80.0" w:type="dxa"/>
-              <w:bottom w:w="50.0" w:type="dxa"/>
-              <w:right w:w="80.0" w:type="dxa"/>
-            </w:tcMar>
-          </w:tcPr>
-          <w:p>
-            <w:pPr>
-              <w:rPr/>
-            </w:pPr>
-            <w:r>
-              <w:rPr>
-                <w:sz w:val="17"/>
-                <w:szCs w:val="17"/>
-                <w:rtl w:val="0"/>
-              </w:rPr>
-              <w:t xml:space="preserve">Insect hearing II: moth ears and bat-evasion behavior (Roeder)</w:t>
+              <w:t>Lecture 14</w:t>
+            </w:r>
+            <w:r>
+              <w:rPr>
+                <w:rtl w:val="0"/>
+              </w:rPr>
+            </w:r>
+          </w:p>
+        </w:tc>
+        <w:tc>
+          <w:tcPr>
+            <w:tcMar>
+              <w:top w:w="50.0" w:type="dxa"/>
+              <w:left w:w="80.0" w:type="dxa"/>
+              <w:bottom w:w="50.0" w:type="dxa"/>
+              <w:right w:w="80.0" w:type="dxa"/>
+            </w:tcMar>
+          </w:tcPr>
+          <w:p>
+            <w:pPr>
+              <w:rPr/>
+            </w:pPr>
+            <w:r>
+              <w:rPr>
+                <w:sz w:val="17"/>
+                <w:szCs w:val="17"/>
+                <w:rtl w:val="0"/>
+              </w:rPr>
+              <w:t xml:space="preserve">Insect hearing I: cricket phonotaxis and song recognition (Hoy)</w:t>
             </w:r>
             <w:r>
               <w:rPr>
@@ -11512,7 +11517,6 @@
         </w:trPr>
         <w:tc>
           <w:tcPr>
-            <w:shd w:fill="fafafa" w:val="clear"/>
             <w:tcMar>
               <w:top w:w="50.0" w:type="dxa"/>
               <w:left w:w="80.0" w:type="dxa"/>
@@ -11541,65 +11545,62 @@
         </w:tc>
         <w:tc>
           <w:tcPr>
-            <w:shd w:fill="fafafa" w:val="clear"/>
-            <w:tcMar>
-              <w:top w:w="50.0" w:type="dxa"/>
-              <w:left w:w="80.0" w:type="dxa"/>
-              <w:bottom w:w="50.0" w:type="dxa"/>
-              <w:right w:w="80.0" w:type="dxa"/>
-            </w:tcMar>
-          </w:tcPr>
-          <w:p>
-            <w:pPr>
-              <w:rPr/>
-            </w:pPr>
-            <w:r>
-              <w:rPr>
-                <w:sz w:val="17"/>
-                <w:szCs w:val="17"/>
-                <w:rtl w:val="0"/>
-              </w:rPr>
-              <w:t>Lecture 16</w:t>
-            </w:r>
-            <w:r>
-              <w:rPr>
-                <w:rtl w:val="0"/>
-              </w:rPr>
-            </w:r>
-          </w:p>
-        </w:tc>
-        <w:tc>
-          <w:tcPr>
-            <w:shd w:fill="fafafa" w:val="clear"/>
-            <w:tcMar>
-              <w:top w:w="50.0" w:type="dxa"/>
-              <w:left w:w="80.0" w:type="dxa"/>
-              <w:bottom w:w="50.0" w:type="dxa"/>
-              <w:right w:w="80.0" w:type="dxa"/>
-            </w:tcMar>
-          </w:tcPr>
-          <w:p>
-            <w:pPr>
-              <w:rPr/>
-            </w:pPr>
-            <w:r>
-              <w:rPr>
-                <w:sz w:val="17"/>
-                <w:szCs w:val="17"/>
-                <w:rtl w:val="0"/>
-              </w:rPr>
-              <w:t xml:space="preserve">Bat echolocation I: CF-FM bats and Doppler-shift compensation (Suga)</w:t>
-            </w:r>
-            <w:r>
-              <w:rPr>
-                <w:rtl w:val="0"/>
-              </w:rPr>
-            </w:r>
-          </w:p>
-        </w:tc>
-        <w:tc>
-          <w:tcPr>
-            <w:shd w:fill="fafafa" w:val="clear"/>
+            <w:tcMar>
+              <w:top w:w="50.0" w:type="dxa"/>
+              <w:left w:w="80.0" w:type="dxa"/>
+              <w:bottom w:w="50.0" w:type="dxa"/>
+              <w:right w:w="80.0" w:type="dxa"/>
+            </w:tcMar>
+          </w:tcPr>
+          <w:p>
+            <w:pPr>
+              <w:rPr/>
+            </w:pPr>
+            <w:r>
+              <w:rPr>
+                <w:sz w:val="17"/>
+                <w:szCs w:val="17"/>
+                <w:rtl w:val="0"/>
+              </w:rPr>
+              <w:t>Lecture 15</w:t>
+            </w:r>
+            <w:r>
+              <w:rPr>
+                <w:rtl w:val="0"/>
+              </w:rPr>
+            </w:r>
+          </w:p>
+        </w:tc>
+        <w:tc>
+          <w:tcPr>
+            <w:tcMar>
+              <w:top w:w="50.0" w:type="dxa"/>
+              <w:left w:w="80.0" w:type="dxa"/>
+              <w:bottom w:w="50.0" w:type="dxa"/>
+              <w:right w:w="80.0" w:type="dxa"/>
+            </w:tcMar>
+          </w:tcPr>
+          <w:p>
+            <w:pPr>
+              <w:rPr/>
+            </w:pPr>
+            <w:r>
+              <w:rPr>
+                <w:sz w:val="17"/>
+                <w:szCs w:val="17"/>
+                <w:rtl w:val="0"/>
+              </w:rPr>
+              <w:t xml:space="preserve">Insect hearing II: moth ears and bat-evasion behavior (Roeder)</w:t>
+            </w:r>
+            <w:r>
+              <w:rPr>
+                <w:rtl w:val="0"/>
+              </w:rPr>
+            </w:r>
+          </w:p>
+        </w:tc>
+        <w:tc>
+          <w:tcPr>
             <w:tcMar>
               <w:top w:w="50.0" w:type="dxa"/>
               <w:left w:w="80.0" w:type="dxa"/>
@@ -11797,7 +11798,7 @@
                 <w:szCs w:val="17"/>
                 <w:rtl w:val="0"/>
               </w:rPr>
-              <w:t>Lecture 17</w:t>
+              <w:t>Lecture 16</w:t>
             </w:r>
             <w:r>
               <w:rPr>
@@ -11826,7 +11827,7 @@
                 <w:szCs w:val="17"/>
                 <w:rtl w:val="0"/>
               </w:rPr>
-              <w:t xml:space="preserve">Bat echolocation II: FM bats, target-range computation, clutter rejection</w:t>
+              <w:t xml:space="preserve">Bat echolocation I: CF-FM bats and Doppler-shift compensation (Suga)</w:t>
             </w:r>
             <w:r>
               <w:rPr>
@@ -11912,7 +11913,7 @@
                 <w:szCs w:val="17"/>
                 <w:rtl w:val="0"/>
               </w:rPr>
-              <w:t>Special Topic 1</w:t>
+              <w:t>Lecture 17</w:t>
             </w:r>
             <w:r>
               <w:rPr>
@@ -11941,7 +11942,7 @@
                 <w:szCs w:val="17"/>
                 <w:rtl w:val="0"/>
               </w:rPr>
-              <w:t>Dolphins I: anatomy/neural pathways supporting echolocation &amp; biosonar, auditory scene analysis during prey tracking and hunting strategies</w:t>
+              <w:t xml:space="preserve">Bat echolocation II: FM bats, target-range computation, clutter rejection</w:t>
             </w:r>
             <w:r>
               <w:rPr>
@@ -11969,7 +11970,6 @@
                 <w:sz w:val="17"/>
                 <w:rtl w:val="0"/>
               </w:rPr>
-              <w:t>Covered on Exam 2</w:t>
             </w:r>
           </w:p>
         </w:tc>
@@ -12755,7 +12755,7 @@
                 <w:szCs w:val="17"/>
                 <w:rtl w:val="0"/>
               </w:rPr>
-              <w:t>Lab 7 meets: weakly electric fish: electric organ discharge recordings and the jamming avoidance response</w:t>
+              <w:t>Lab 7 meets: weakly electric fish: electric organ discharge recordings and active electrolocation</w:t>
             </w:r>
             <w:r>
               <w:rPr>
@@ -12802,6 +12802,7 @@
         </w:trPr>
         <w:tc>
           <w:tcPr>
+            <w:shd w:fill="fafafa" w:val="clear"/>
             <w:tcMar>
               <w:top w:w="50.0" w:type="dxa"/>
               <w:left w:w="80.0" w:type="dxa"/>
@@ -12830,78 +12831,82 @@
         </w:tc>
         <w:tc>
           <w:tcPr>
-            <w:tcMar>
-              <w:top w:w="50.0" w:type="dxa"/>
-              <w:left w:w="80.0" w:type="dxa"/>
-              <w:bottom w:w="50.0" w:type="dxa"/>
-              <w:right w:w="80.0" w:type="dxa"/>
-            </w:tcMar>
-          </w:tcPr>
-          <w:p>
-            <w:pPr>
-              <w:rPr/>
-            </w:pPr>
-            <w:r>
-              <w:rPr>
-                <w:sz w:val="17"/>
-                <w:szCs w:val="17"/>
-                <w:rtl w:val="0"/>
-              </w:rPr>
-              <w:t>Lecture 22</w:t>
-            </w:r>
-            <w:r>
-              <w:rPr>
-                <w:rtl w:val="0"/>
-              </w:rPr>
-            </w:r>
-          </w:p>
-        </w:tc>
-        <w:tc>
-          <w:tcPr>
-            <w:tcMar>
-              <w:top w:w="50.0" w:type="dxa"/>
-              <w:left w:w="80.0" w:type="dxa"/>
-              <w:bottom w:w="50.0" w:type="dxa"/>
-              <w:right w:w="80.0" w:type="dxa"/>
-            </w:tcMar>
-          </w:tcPr>
-          <w:p>
-            <w:pPr>
-              <w:rPr/>
-            </w:pPr>
-            <w:r>
-              <w:rPr>
-                <w:sz w:val="17"/>
-                <w:szCs w:val="17"/>
-                <w:rtl w:val="0"/>
-              </w:rPr>
-              <w:t xml:space="preserve">Electroreception III: the jamming avoidance response (Heiligenberg)</w:t>
-            </w:r>
-            <w:r>
-              <w:rPr>
-                <w:rtl w:val="0"/>
-              </w:rPr>
-            </w:r>
-          </w:p>
-        </w:tc>
-        <w:tc>
-          <w:tcPr>
-            <w:tcMar>
-              <w:top w:w="50.0" w:type="dxa"/>
-              <w:left w:w="80.0" w:type="dxa"/>
-              <w:bottom w:w="50.0" w:type="dxa"/>
-              <w:right w:w="80.0" w:type="dxa"/>
-            </w:tcMar>
-          </w:tcPr>
-          <w:p>
-            <w:pPr>
-              <w:rPr/>
-            </w:pPr>
-            <w:r>
-              <w:rPr>
-                <w:sz w:val="17"/>
-                <w:rtl w:val="0"/>
-              </w:rPr>
+            <w:shd w:fill="fafafa" w:val="clear"/>
+            <w:tcMar>
+              <w:top w:w="50.0" w:type="dxa"/>
+              <w:left w:w="80.0" w:type="dxa"/>
+              <w:bottom w:w="50.0" w:type="dxa"/>
+              <w:right w:w="80.0" w:type="dxa"/>
+            </w:tcMar>
+          </w:tcPr>
+          <w:p>
+            <w:pPr>
+              <w:rPr/>
+            </w:pPr>
+            <w:r>
+              <w:rPr>
+                <w:sz w:val="17"/>
+                <w:szCs w:val="17"/>
+                <w:rtl w:val="0"/>
+              </w:rPr>
+              <w:t>Special Topic 2</w:t>
+            </w:r>
+            <w:r>
+              <w:rPr>
+                <w:rtl w:val="0"/>
+              </w:rPr>
+            </w:r>
+          </w:p>
+        </w:tc>
+        <w:tc>
+          <w:tcPr>
+            <w:shd w:fill="fafafa" w:val="clear"/>
+            <w:tcMar>
+              <w:top w:w="50.0" w:type="dxa"/>
+              <w:left w:w="80.0" w:type="dxa"/>
+              <w:bottom w:w="50.0" w:type="dxa"/>
+              <w:right w:w="80.0" w:type="dxa"/>
+            </w:tcMar>
+          </w:tcPr>
+          <w:p>
+            <w:pPr>
+              <w:rPr/>
+            </w:pPr>
+            <w:r>
+              <w:rPr>
+                <w:sz w:val="17"/>
+                <w:szCs w:val="17"/>
+                <w:rtl w:val="0"/>
+              </w:rPr>
+              <w:t>Axolotl: lateral-line sensing, electroreception, and sensory processing of courtship signals</w:t>
+            </w:r>
+            <w:r>
+              <w:rPr>
+                <w:rtl w:val="0"/>
+              </w:rPr>
+            </w:r>
+          </w:p>
+        </w:tc>
+        <w:tc>
+          <w:tcPr>
+            <w:shd w:fill="fafafa" w:val="clear"/>
+            <w:tcMar>
+              <w:top w:w="50.0" w:type="dxa"/>
+              <w:left w:w="80.0" w:type="dxa"/>
+              <w:bottom w:w="50.0" w:type="dxa"/>
+              <w:right w:w="80.0" w:type="dxa"/>
+            </w:tcMar>
+          </w:tcPr>
+          <w:p>
+            <w:pPr>
+              <w:rPr/>
+            </w:pPr>
+            <w:r>
+              <w:rPr>
+                <w:sz w:val="17"/>
+                <w:rtl w:val="0"/>
+              </w:rPr>
+              <w:t>Not on the exam</w:t>
             </w:r>
           </w:p>
         </w:tc>
@@ -13010,7 +13015,7 @@
                 <w:szCs w:val="17"/>
                 <w:rtl w:val="0"/>
               </w:rPr>
-              <w:t>Covers Lectures 11 to 20 and Special Topic 1</w:t>
+              <w:t>Covers Lectures 11 to 20</w:t>
             </w:r>
             <w:r>
               <w:rPr>
@@ -13064,7 +13069,6 @@
         </w:trPr>
         <w:tc>
           <w:tcPr>
-            <w:shd w:fill="fafafa" w:val="clear"/>
             <w:tcMar>
               <w:top w:w="50.0" w:type="dxa"/>
               <w:left w:w="80.0" w:type="dxa"/>
@@ -13093,82 +13097,78 @@
         </w:tc>
         <w:tc>
           <w:tcPr>
-            <w:shd w:fill="fafafa" w:val="clear"/>
-            <w:tcMar>
-              <w:top w:w="50.0" w:type="dxa"/>
-              <w:left w:w="80.0" w:type="dxa"/>
-              <w:bottom w:w="50.0" w:type="dxa"/>
-              <w:right w:w="80.0" w:type="dxa"/>
-            </w:tcMar>
-          </w:tcPr>
-          <w:p>
-            <w:pPr>
-              <w:rPr/>
-            </w:pPr>
-            <w:r>
-              <w:rPr>
-                <w:sz w:val="17"/>
-                <w:szCs w:val="17"/>
-                <w:rtl w:val="0"/>
-              </w:rPr>
-              <w:t>Special Topic 2</w:t>
-            </w:r>
-            <w:r>
-              <w:rPr>
-                <w:rtl w:val="0"/>
-              </w:rPr>
-            </w:r>
-          </w:p>
-        </w:tc>
-        <w:tc>
-          <w:tcPr>
-            <w:shd w:fill="fafafa" w:val="clear"/>
-            <w:tcMar>
-              <w:top w:w="50.0" w:type="dxa"/>
-              <w:left w:w="80.0" w:type="dxa"/>
-              <w:bottom w:w="50.0" w:type="dxa"/>
-              <w:right w:w="80.0" w:type="dxa"/>
-            </w:tcMar>
-          </w:tcPr>
-          <w:p>
-            <w:pPr>
-              <w:rPr/>
-            </w:pPr>
-            <w:r>
-              <w:rPr>
-                <w:sz w:val="17"/>
-                <w:szCs w:val="17"/>
-                <w:rtl w:val="0"/>
-              </w:rPr>
-              <w:t>Axolotl: lateral-line sensing, electroreception, and sensory processing of courtship signals</w:t>
-            </w:r>
-            <w:r>
-              <w:rPr>
-                <w:rtl w:val="0"/>
-              </w:rPr>
-            </w:r>
-          </w:p>
-        </w:tc>
-        <w:tc>
-          <w:tcPr>
-            <w:shd w:fill="fafafa" w:val="clear"/>
-            <w:tcMar>
-              <w:top w:w="50.0" w:type="dxa"/>
-              <w:left w:w="80.0" w:type="dxa"/>
-              <w:bottom w:w="50.0" w:type="dxa"/>
-              <w:right w:w="80.0" w:type="dxa"/>
-            </w:tcMar>
-          </w:tcPr>
-          <w:p>
-            <w:pPr>
-              <w:rPr/>
-            </w:pPr>
-            <w:r>
-              <w:rPr>
-                <w:sz w:val="17"/>
-                <w:rtl w:val="0"/>
-              </w:rPr>
-              <w:t>Covered on Exam 3</w:t>
+            <w:tcMar>
+              <w:top w:w="50.0" w:type="dxa"/>
+              <w:left w:w="80.0" w:type="dxa"/>
+              <w:bottom w:w="50.0" w:type="dxa"/>
+              <w:right w:w="80.0" w:type="dxa"/>
+            </w:tcMar>
+          </w:tcPr>
+          <w:p>
+            <w:pPr>
+              <w:rPr/>
+            </w:pPr>
+            <w:r>
+              <w:rPr>
+                <w:sz w:val="17"/>
+                <w:szCs w:val="17"/>
+                <w:rtl w:val="0"/>
+              </w:rPr>
+              <w:t>Lecture 22</w:t>
+            </w:r>
+            <w:r>
+              <w:rPr>
+                <w:rtl w:val="0"/>
+              </w:rPr>
+            </w:r>
+          </w:p>
+        </w:tc>
+        <w:tc>
+          <w:tcPr>
+            <w:tcMar>
+              <w:top w:w="50.0" w:type="dxa"/>
+              <w:left w:w="80.0" w:type="dxa"/>
+              <w:bottom w:w="50.0" w:type="dxa"/>
+              <w:right w:w="80.0" w:type="dxa"/>
+            </w:tcMar>
+          </w:tcPr>
+          <w:p>
+            <w:pPr>
+              <w:rPr/>
+            </w:pPr>
+            <w:r>
+              <w:rPr>
+                <w:sz w:val="17"/>
+                <w:szCs w:val="17"/>
+                <w:rtl w:val="0"/>
+              </w:rPr>
+              <w:t xml:space="preserve">Electroreception III: the jamming avoidance response (Heiligenberg)</w:t>
+            </w:r>
+            <w:r>
+              <w:rPr>
+                <w:rtl w:val="0"/>
+              </w:rPr>
+            </w:r>
+          </w:p>
+        </w:tc>
+        <w:tc>
+          <w:tcPr>
+            <w:tcMar>
+              <w:top w:w="50.0" w:type="dxa"/>
+              <w:left w:w="80.0" w:type="dxa"/>
+              <w:bottom w:w="50.0" w:type="dxa"/>
+              <w:right w:w="80.0" w:type="dxa"/>
+            </w:tcMar>
+          </w:tcPr>
+          <w:p>
+            <w:pPr>
+              <w:rPr/>
+            </w:pPr>
+            <w:r>
+              <w:rPr>
+                <w:sz w:val="17"/>
+                <w:rtl w:val="0"/>
+              </w:rPr>
             </w:r>
           </w:p>
         </w:tc>
@@ -16092,7 +16092,7 @@
                 <w:szCs w:val="17"/>
                 <w:rtl w:val="0"/>
               </w:rPr>
-              <w:t>Lab 10 meets: song learning: tutor–pupil song similarity in zebra finches</w:t>
+              <w:t>Lab 10 meets: songbird song structure: syllable segmentation and song stereotypy in zebra finch recordings</w:t>
             </w:r>
             <w:r>
               <w:rPr>
@@ -16139,6 +16139,7 @@
         </w:trPr>
         <w:tc>
           <w:tcPr>
+            <w:shd w:fill="fafafa" w:val="clear"/>
             <w:tcMar>
               <w:top w:w="50.0" w:type="dxa"/>
               <w:left w:w="80.0" w:type="dxa"/>
@@ -16167,78 +16168,82 @@
         </w:tc>
         <w:tc>
           <w:tcPr>
-            <w:tcMar>
-              <w:top w:w="50.0" w:type="dxa"/>
-              <w:left w:w="80.0" w:type="dxa"/>
-              <w:bottom w:w="50.0" w:type="dxa"/>
-              <w:right w:w="80.0" w:type="dxa"/>
-            </w:tcMar>
-          </w:tcPr>
-          <w:p>
-            <w:pPr>
-              <w:rPr/>
-            </w:pPr>
-            <w:r>
-              <w:rPr>
-                <w:sz w:val="17"/>
-                <w:szCs w:val="17"/>
-                <w:rtl w:val="0"/>
-              </w:rPr>
-              <w:t>Lecture 33</w:t>
-            </w:r>
-            <w:r>
-              <w:rPr>
-                <w:rtl w:val="0"/>
-              </w:rPr>
-            </w:r>
-          </w:p>
-        </w:tc>
-        <w:tc>
-          <w:tcPr>
-            <w:tcMar>
-              <w:top w:w="50.0" w:type="dxa"/>
-              <w:left w:w="80.0" w:type="dxa"/>
-              <w:bottom w:w="50.0" w:type="dxa"/>
-              <w:right w:w="80.0" w:type="dxa"/>
-            </w:tcMar>
-          </w:tcPr>
-          <w:p>
-            <w:pPr>
-              <w:rPr/>
-            </w:pPr>
-            <w:r>
-              <w:rPr>
-                <w:sz w:val="17"/>
-                <w:szCs w:val="17"/>
-                <w:rtl w:val="0"/>
-              </w:rPr>
-              <w:t xml:space="preserve">Vocal communication II: song learning, sensitive periods, and the template model (Marler &amp; Konishi)</w:t>
-            </w:r>
-            <w:r>
-              <w:rPr>
-                <w:rtl w:val="0"/>
-              </w:rPr>
-            </w:r>
-          </w:p>
-        </w:tc>
-        <w:tc>
-          <w:tcPr>
-            <w:tcMar>
-              <w:top w:w="50.0" w:type="dxa"/>
-              <w:left w:w="80.0" w:type="dxa"/>
-              <w:bottom w:w="50.0" w:type="dxa"/>
-              <w:right w:w="80.0" w:type="dxa"/>
-            </w:tcMar>
-          </w:tcPr>
-          <w:p>
-            <w:pPr>
-              <w:rPr/>
-            </w:pPr>
-            <w:r>
-              <w:rPr>
-                <w:sz w:val="17"/>
-                <w:rtl w:val="0"/>
-              </w:rPr>
+            <w:shd w:fill="fafafa" w:val="clear"/>
+            <w:tcMar>
+              <w:top w:w="50.0" w:type="dxa"/>
+              <w:left w:w="80.0" w:type="dxa"/>
+              <w:bottom w:w="50.0" w:type="dxa"/>
+              <w:right w:w="80.0" w:type="dxa"/>
+            </w:tcMar>
+          </w:tcPr>
+          <w:p>
+            <w:pPr>
+              <w:rPr/>
+            </w:pPr>
+            <w:r>
+              <w:rPr>
+                <w:sz w:val="17"/>
+                <w:szCs w:val="17"/>
+                <w:rtl w:val="0"/>
+              </w:rPr>
+              <w:t>Special Topic 3</w:t>
+            </w:r>
+            <w:r>
+              <w:rPr>
+                <w:rtl w:val="0"/>
+              </w:rPr>
+            </w:r>
+          </w:p>
+        </w:tc>
+        <w:tc>
+          <w:tcPr>
+            <w:shd w:fill="fafafa" w:val="clear"/>
+            <w:tcMar>
+              <w:top w:w="50.0" w:type="dxa"/>
+              <w:left w:w="80.0" w:type="dxa"/>
+              <w:bottom w:w="50.0" w:type="dxa"/>
+              <w:right w:w="80.0" w:type="dxa"/>
+            </w:tcMar>
+          </w:tcPr>
+          <w:p>
+            <w:pPr>
+              <w:rPr/>
+            </w:pPr>
+            <w:r>
+              <w:rPr>
+                <w:sz w:val="17"/>
+                <w:szCs w:val="17"/>
+                <w:rtl w:val="0"/>
+              </w:rPr>
+              <w:t>Songbirds I: Artificial song memories, optogenetic tutoring, and neural mechanisms of vocal imitation</w:t>
+            </w:r>
+            <w:r>
+              <w:rPr>
+                <w:rtl w:val="0"/>
+              </w:rPr>
+            </w:r>
+          </w:p>
+        </w:tc>
+        <w:tc>
+          <w:tcPr>
+            <w:shd w:fill="fafafa" w:val="clear"/>
+            <w:tcMar>
+              <w:top w:w="50.0" w:type="dxa"/>
+              <w:left w:w="80.0" w:type="dxa"/>
+              <w:bottom w:w="50.0" w:type="dxa"/>
+              <w:right w:w="80.0" w:type="dxa"/>
+            </w:tcMar>
+          </w:tcPr>
+          <w:p>
+            <w:pPr>
+              <w:rPr/>
+            </w:pPr>
+            <w:r>
+              <w:rPr>
+                <w:sz w:val="17"/>
+                <w:rtl w:val="0"/>
+              </w:rPr>
+              <w:t>Not on the exam</w:t>
             </w:r>
           </w:p>
         </w:tc>
@@ -16347,7 +16352,7 @@
                 <w:szCs w:val="17"/>
                 <w:rtl w:val="0"/>
               </w:rPr>
-              <w:t>Covers Lectures 21 to 30 and Special Topic 2</w:t>
+              <w:t>Covers Lectures 21 to 30</w:t>
             </w:r>
             <w:r>
               <w:rPr>
@@ -16401,7 +16406,6 @@
         </w:trPr>
         <w:tc>
           <w:tcPr>
-            <w:shd w:fill="fafafa" w:val="clear"/>
             <w:tcMar>
               <w:top w:w="50.0" w:type="dxa"/>
               <w:left w:w="80.0" w:type="dxa"/>
@@ -16430,84 +16434,69 @@
         </w:tc>
         <w:tc>
           <w:tcPr>
-            <w:shd w:fill="fafafa" w:val="clear"/>
-            <w:tcMar>
-              <w:top w:w="50.0" w:type="dxa"/>
-              <w:left w:w="80.0" w:type="dxa"/>
-              <w:bottom w:w="50.0" w:type="dxa"/>
-              <w:right w:w="80.0" w:type="dxa"/>
-            </w:tcMar>
-          </w:tcPr>
-          <w:p>
-            <w:pPr>
-              <w:rPr/>
-            </w:pPr>
-            <w:r>
-              <w:rPr>
-                <w:sz w:val="17"/>
-                <w:szCs w:val="17"/>
-                <w:rtl w:val="0"/>
-              </w:rPr>
-              <w:t>Special Topic 3</w:t>
-            </w:r>
-            <w:r>
-              <w:rPr>
-                <w:rtl w:val="0"/>
-              </w:rPr>
-            </w:r>
-          </w:p>
-        </w:tc>
-        <w:tc>
-          <w:tcPr>
-            <w:shd w:fill="fafafa" w:val="clear"/>
-            <w:tcMar>
-              <w:top w:w="50.0" w:type="dxa"/>
-              <w:left w:w="80.0" w:type="dxa"/>
-              <w:bottom w:w="50.0" w:type="dxa"/>
-              <w:right w:w="80.0" w:type="dxa"/>
-            </w:tcMar>
-          </w:tcPr>
-          <w:p>
-            <w:pPr>
-              <w:rPr/>
-            </w:pPr>
-            <w:r>
-              <w:rPr>
-                <w:sz w:val="17"/>
-                <w:szCs w:val="17"/>
-                <w:rtl w:val="0"/>
-              </w:rPr>
-              <w:t>Songbirds I: Artificial song memories, optogenetic tutoring, and neural mechanisms of vocal imitation</w:t>
-            </w:r>
-            <w:r>
-              <w:rPr>
-                <w:rtl w:val="0"/>
-              </w:rPr>
-            </w:r>
-          </w:p>
-        </w:tc>
-        <w:tc>
-          <w:tcPr>
-            <w:shd w:fill="fafafa" w:val="clear"/>
-            <w:tcMar>
-              <w:top w:w="50.0" w:type="dxa"/>
-              <w:left w:w="80.0" w:type="dxa"/>
-              <w:bottom w:w="50.0" w:type="dxa"/>
-              <w:right w:w="80.0" w:type="dxa"/>
-            </w:tcMar>
-          </w:tcPr>
-          <w:p>
-            <w:pPr>
-              <w:rPr/>
-            </w:pPr>
-            <w:r>
-              <w:rPr>
-                <w:sz w:val="17"/>
-                <w:rtl w:val="0"/>
-              </w:rPr>
-              <w:t>Covered on Exam 4</w:t>
-            </w:r>
-          </w:p>
+            <w:tcMar>
+              <w:top w:w="50.0" w:type="dxa"/>
+              <w:left w:w="80.0" w:type="dxa"/>
+              <w:bottom w:w="50.0" w:type="dxa"/>
+              <w:right w:w="80.0" w:type="dxa"/>
+            </w:tcMar>
+          </w:tcPr>
+          <w:p>
+            <w:pPr>
+              <w:rPr/>
+            </w:pPr>
+            <w:r>
+              <w:rPr>
+                <w:sz w:val="17"/>
+                <w:szCs w:val="17"/>
+                <w:rtl w:val="0"/>
+              </w:rPr>
+              <w:t>Lecture 33</w:t>
+            </w:r>
+            <w:r>
+              <w:rPr>
+                <w:rtl w:val="0"/>
+              </w:rPr>
+            </w:r>
+          </w:p>
+        </w:tc>
+        <w:tc>
+          <w:tcPr>
+            <w:tcMar>
+              <w:top w:w="50.0" w:type="dxa"/>
+              <w:left w:w="80.0" w:type="dxa"/>
+              <w:bottom w:w="50.0" w:type="dxa"/>
+              <w:right w:w="80.0" w:type="dxa"/>
+            </w:tcMar>
+          </w:tcPr>
+          <w:p>
+            <w:pPr>
+              <w:rPr/>
+            </w:pPr>
+            <w:r>
+              <w:rPr>
+                <w:sz w:val="17"/>
+                <w:szCs w:val="17"/>
+                <w:rtl w:val="0"/>
+              </w:rPr>
+              <w:t xml:space="preserve">Vocal communication II: song learning, sensitive periods, and the template model (Marler &amp; Konishi)</w:t>
+            </w:r>
+            <w:r>
+              <w:rPr>
+                <w:rtl w:val="0"/>
+              </w:rPr>
+            </w:r>
+          </w:p>
+        </w:tc>
+        <w:tc>
+          <w:tcPr>
+            <w:tcMar>
+              <w:top w:w="50.0" w:type="dxa"/>
+              <w:left w:w="80.0" w:type="dxa"/>
+              <w:bottom w:w="50.0" w:type="dxa"/>
+              <w:right w:w="80.0" w:type="dxa"/>
+            </w:tcMar>
+          </w:tcPr>
           <w:p>
             <w:pPr>
               <w:rPr/>
@@ -18145,7 +18134,7 @@
                 <w:szCs w:val="17"/>
                 <w:rtl w:val="0"/>
               </w:rPr>
-              <w:t>Covers Lectures 31 to 40 and Special Topic 3</w:t>
+              <w:t>Covers Lectures 31 to 40</w:t>
             </w:r>
             <w:r>
               <w:rPr>
@@ -20435,7 +20424,7 @@
                 <w:szCs w:val="17"/>
                 <w:rtl w:val="0"/>
               </w:rPr>
-              <w:t xml:space="preserve">Lecture 12</w:t>
+              <w:t>Special Topic 1</w:t>
             </w:r>
             <w:r>
               <w:rPr>
@@ -20463,7 +20452,7 @@
                 <w:szCs w:val="17"/>
                 <w:rtl w:val="0"/>
               </w:rPr>
-              <w:t xml:space="preserve">Insect vision II: jumping spider eyes and predatory tracking (Land)</w:t>
+              <w:t>Jellyfish I: neuroanatomy of Cassiopea, distributed nerve nets, rhopalia, and pacemaker control of rhythmic bell contractions</w:t>
             </w:r>
             <w:r>
               <w:rPr>
@@ -20491,61 +20480,75 @@
                 <w:szCs w:val="17"/>
                 <w:rtl w:val="0"/>
               </w:rPr>
-              <w:t xml:space="preserve">Zurek DB, Cronin TW, Taylor LA, Byrne K, Sullivan MLG, Morehouse NI (2015). Spectral filtering enables trichromatic vision in colorful jumping spiders. Current Biology 25: R403–R404. https://doi.org/10.1016/j.cub.2015.03.033</w:t>
-            </w:r>
-            <w:r>
-              <w:rPr>
-                <w:rtl w:val="0"/>
-              </w:rPr>
-            </w:r>
-          </w:p>
-          <w:p>
-            <w:pPr>
-              <w:rPr/>
-            </w:pPr>
-            <w:r>
-              <w:rPr>
-                <w:sz w:val="17"/>
-                <w:szCs w:val="17"/>
-                <w:rtl w:val="0"/>
-              </w:rPr>
-              <w:t xml:space="preserve">Zurek DB, Taylor AJ, Evans CS, Nelson XJ (2010). The role of the anterior lateral eyes in the vision-based behaviour of jumping spiders. Journal of Experimental Biology 213: 2372–2378. https://doi.org/10.1242/jeb.042382</w:t>
-            </w:r>
-            <w:r>
-              <w:rPr>
-                <w:rtl w:val="0"/>
-              </w:rPr>
-            </w:r>
-          </w:p>
-          <w:p>
-            <w:pPr>
-              <w:rPr/>
-            </w:pPr>
-            <w:r>
-              <w:rPr>
-                <w:sz w:val="17"/>
-                <w:szCs w:val="17"/>
-                <w:rtl w:val="0"/>
-              </w:rPr>
-              <w:t xml:space="preserve">Land MF (1969a). Structure of the retinae of the principal eyes of jumping spiders (Salticidae: Dendryphantinae) in relation to visual optics. Journal of Experimental Biology 51: 443–470. https://doi.org/10.1242/jeb.51.2.443</w:t>
-            </w:r>
-            <w:r>
-              <w:rPr>
-                <w:rtl w:val="0"/>
-              </w:rPr>
-            </w:r>
-          </w:p>
-          <w:p>
-            <w:pPr>
-              <w:rPr/>
-            </w:pPr>
-            <w:r>
-              <w:rPr>
-                <w:sz w:val="17"/>
-                <w:szCs w:val="17"/>
-                <w:rtl w:val="0"/>
-              </w:rPr>
-              <w:t xml:space="preserve">Nagata T, Koyanagi M, Tsukamoto H, Saeki S, Isono K, Shichida Y, Tokunaga F, Kinoshita M, Arikawa K, Terakita A (2012). Depth perception from image defocus in a jumping spider. Science 335: 469–471. https://doi.org/10.1126/science.1211667</w:t>
+              <w:t>Amplatz K, Zieger E, Abed-Navandi D, Weissenbacher A, Wanninger A (2024). Neuromuscular development in the emerging scyphozoan model system, Cassiopea xamachana: implications for the evolution of cnidarian nervous systems. Frontiers in Neuroscience 17: 1324980. https://doi.org/10.3389/fnins.2023.1324980</w:t>
+            </w:r>
+            <w:r>
+              <w:rPr>
+                <w:rtl w:val="0"/>
+              </w:rPr>
+            </w:r>
+          </w:p>
+          <w:p>
+            <w:pPr>
+              <w:rPr/>
+            </w:pPr>
+            <w:r>
+              <w:rPr>
+                <w:sz w:val="17"/>
+                <w:szCs w:val="17"/>
+                <w:rtl w:val="0"/>
+              </w:rPr>
+              <w:t>Nakanishi N, Hartenstein V, Jacobs DK (2009). Development of the rhopalial nervous system in Aurelia sp.1 (Cnidaria, Scyphozoa). Development Genes and Evolution 219(6): 301-317. https://doi.org/10.1007/s00427-009-0291-y</w:t>
+            </w:r>
+            <w:r>
+              <w:rPr>
+                <w:sz w:val="15"/>
+                <w:szCs w:val="15"/>
+                <w:rtl w:val="0"/>
+              </w:rPr>
+            </w:r>
+            <w:r>
+              <w:rPr>
+                <w:sz w:val="17"/>
+                <w:szCs w:val="17"/>
+                <w:rtl w:val="0"/>
+              </w:rPr>
+            </w:r>
+            <w:r>
+              <w:rPr>
+                <w:rtl w:val="0"/>
+              </w:rPr>
+            </w:r>
+          </w:p>
+          <w:p>
+            <w:pPr>
+              <w:rPr/>
+            </w:pPr>
+            <w:r>
+              <w:rPr>
+                <w:sz w:val="17"/>
+                <w:szCs w:val="17"/>
+                <w:rtl w:val="0"/>
+              </w:rPr>
+              <w:t>Muffett KM, Mammone M, Puckett J, Martino G, Aditi, Miglietta MP (2025). Regeneration and Musculature in Halved Cassiopea xamachana Ephyrae. Integrative Organismal Biology 7(1): obaf030. https://doi.org/10.1093/iob/obaf030</w:t>
+            </w:r>
+            <w:r>
+              <w:rPr>
+                <w:rtl w:val="0"/>
+              </w:rPr>
+            </w:r>
+          </w:p>
+          <w:p>
+            <w:pPr>
+              <w:rPr/>
+            </w:pPr>
+            <w:r>
+              <w:rPr>
+                <w:sz w:val="17"/>
+                <w:szCs w:val="17"/>
+                <w:rtl w:val="0"/>
+              </w:rPr>
+              <w:t>Anuszczyk SR, Yoder N, Costello JH, Dabiri JO, Gemmell BJ, Rutledge KM, Colin SP (2025). Increasing the Reliability and Versatility of Jellyfish Biohybrid Vehicles via Species Selection and Rhopalia Removal. Biomimetics 10(12): 810. https://doi.org/10.3390/biomimetics10120810</w:t>
             </w:r>
             <w:r>
               <w:rPr>
@@ -20607,7 +20610,7 @@
                 <w:szCs w:val="17"/>
                 <w:rtl w:val="0"/>
               </w:rPr>
-              <w:t xml:space="preserve">Lecture 13</w:t>
+              <w:t xml:space="preserve">Lecture 12</w:t>
             </w:r>
             <w:r>
               <w:rPr>
@@ -20635,7 +20638,7 @@
                 <w:szCs w:val="17"/>
                 <w:rtl w:val="0"/>
               </w:rPr>
-              <w:t xml:space="preserve">Mantis shrimp vision: hyperspectral and polarization sensing</w:t>
+              <w:t xml:space="preserve">Insect vision II: jumping spider eyes and predatory tracking (Land)</w:t>
             </w:r>
             <w:r>
               <w:rPr>
@@ -20663,61 +20666,61 @@
                 <w:szCs w:val="17"/>
                 <w:rtl w:val="0"/>
               </w:rPr>
-              <w:t xml:space="preserve">Bok MJ, Roberts NW, Cronin TW (2018). Behavioural evidence for polychromatic ultraviolet sensitivity in mantis shrimp. Proceedings of the Royal Society B: Biological Sciences 285: 20181384. https://doi.org/10.1098/rspb.2018.1384</w:t>
-            </w:r>
-            <w:r>
-              <w:rPr>
-                <w:rtl w:val="0"/>
-              </w:rPr>
-            </w:r>
-          </w:p>
-          <w:p>
-            <w:pPr>
-              <w:rPr/>
-            </w:pPr>
-            <w:r>
-              <w:rPr>
-                <w:sz w:val="17"/>
-                <w:szCs w:val="17"/>
-                <w:rtl w:val="0"/>
-              </w:rPr>
-              <w:t xml:space="preserve">Thoen HH, How MJ, Chiou TH, Marshall J (2014). A Different Form of Color Vision in Mantis Shrimp. Science 343: 411-413. https://doi.org/10.1126/science.1245824</w:t>
-            </w:r>
-            <w:r>
-              <w:rPr>
-                <w:rtl w:val="0"/>
-              </w:rPr>
-            </w:r>
-          </w:p>
-          <w:p>
-            <w:pPr>
-              <w:rPr/>
-            </w:pPr>
-            <w:r>
-              <w:rPr>
-                <w:sz w:val="17"/>
-                <w:szCs w:val="17"/>
-                <w:rtl w:val="0"/>
-              </w:rPr>
-              <w:t xml:space="preserve">Wang CWJ, Marshall NJ (2025). Behavioural evidence of spectral opponent processing in the visual system of stomatopod crustaceans. Journal of Experimental Biology 228: jeb247952. https://doi.org/10.1242/jeb.247952</w:t>
-            </w:r>
-            <w:r>
-              <w:rPr>
-                <w:rtl w:val="0"/>
-              </w:rPr>
-            </w:r>
-          </w:p>
-          <w:p>
-            <w:pPr>
-              <w:rPr/>
-            </w:pPr>
-            <w:r>
-              <w:rPr>
-                <w:sz w:val="17"/>
-                <w:szCs w:val="17"/>
-                <w:rtl w:val="0"/>
-              </w:rPr>
-              <w:t xml:space="preserve">Kleinlogel S, White AG (2008). The Secret World of Shrimps: Polarisation Vision at Its Best. PLoS ONE 3: e2190. https://doi.org/10.1371/journal.pone.0002190</w:t>
+              <w:t xml:space="preserve">Zurek DB, Cronin TW, Taylor LA, Byrne K, Sullivan MLG, Morehouse NI (2015). Spectral filtering enables trichromatic vision in colorful jumping spiders. Current Biology 25: R403–R404. https://doi.org/10.1016/j.cub.2015.03.033</w:t>
+            </w:r>
+            <w:r>
+              <w:rPr>
+                <w:rtl w:val="0"/>
+              </w:rPr>
+            </w:r>
+          </w:p>
+          <w:p>
+            <w:pPr>
+              <w:rPr/>
+            </w:pPr>
+            <w:r>
+              <w:rPr>
+                <w:sz w:val="17"/>
+                <w:szCs w:val="17"/>
+                <w:rtl w:val="0"/>
+              </w:rPr>
+              <w:t xml:space="preserve">Zurek DB, Taylor AJ, Evans CS, Nelson XJ (2010). The role of the anterior lateral eyes in the vision-based behaviour of jumping spiders. Journal of Experimental Biology 213: 2372–2378. https://doi.org/10.1242/jeb.042382</w:t>
+            </w:r>
+            <w:r>
+              <w:rPr>
+                <w:rtl w:val="0"/>
+              </w:rPr>
+            </w:r>
+          </w:p>
+          <w:p>
+            <w:pPr>
+              <w:rPr/>
+            </w:pPr>
+            <w:r>
+              <w:rPr>
+                <w:sz w:val="17"/>
+                <w:szCs w:val="17"/>
+                <w:rtl w:val="0"/>
+              </w:rPr>
+              <w:t xml:space="preserve">Land MF (1969a). Structure of the retinae of the principal eyes of jumping spiders (Salticidae: Dendryphantinae) in relation to visual optics. Journal of Experimental Biology 51: 443–470. https://doi.org/10.1242/jeb.51.2.443</w:t>
+            </w:r>
+            <w:r>
+              <w:rPr>
+                <w:rtl w:val="0"/>
+              </w:rPr>
+            </w:r>
+          </w:p>
+          <w:p>
+            <w:pPr>
+              <w:rPr/>
+            </w:pPr>
+            <w:r>
+              <w:rPr>
+                <w:sz w:val="17"/>
+                <w:szCs w:val="17"/>
+                <w:rtl w:val="0"/>
+              </w:rPr>
+              <w:t xml:space="preserve">Nagata T, Koyanagi M, Tsukamoto H, Saeki S, Isono K, Shichida Y, Tokunaga F, Kinoshita M, Arikawa K, Terakita A (2012). Depth perception from image defocus in a jumping spider. Science 335: 469–471. https://doi.org/10.1126/science.1211667</w:t>
             </w:r>
             <w:r>
               <w:rPr>
@@ -20779,7 +20782,7 @@
                 <w:szCs w:val="17"/>
                 <w:rtl w:val="0"/>
               </w:rPr>
-              <w:t xml:space="preserve">Lecture 14</w:t>
+              <w:t xml:space="preserve">Lecture 13</w:t>
             </w:r>
             <w:r>
               <w:rPr>
@@ -20807,7 +20810,7 @@
                 <w:szCs w:val="17"/>
                 <w:rtl w:val="0"/>
               </w:rPr>
-              <w:t xml:space="preserve">Insect hearing I: cricket phonotaxis and song recognition (Hoy)</w:t>
+              <w:t xml:space="preserve">Mantis shrimp vision: hyperspectral and polarization sensing</w:t>
             </w:r>
             <w:r>
               <w:rPr>
@@ -20835,61 +20838,61 @@
                 <w:szCs w:val="17"/>
                 <w:rtl w:val="0"/>
               </w:rPr>
-              <w:t xml:space="preserve">Pollack GS, Hoy RR (1979). Temporal pattern as a cue for species-specific calling song recognition in crickets. Science 204(4391):429–432. https://doi.org/10.1126/science.204.4391.429</w:t>
-            </w:r>
-            <w:r>
-              <w:rPr>
-                <w:rtl w:val="0"/>
-              </w:rPr>
-            </w:r>
-          </w:p>
-          <w:p>
-            <w:pPr>
-              <w:rPr/>
-            </w:pPr>
-            <w:r>
-              <w:rPr>
-                <w:sz w:val="17"/>
-                <w:szCs w:val="17"/>
-                <w:rtl w:val="0"/>
-              </w:rPr>
-              <w:t xml:space="preserve">Kostarakos K, Hedwig B (2012). Calling song recognition in female crickets: temporal tuning of identified brain neurons matches behavior. Journal of Neuroscience 32(28):9601–9612. https://doi.org/10.1523/JNEUROSCI.1170-12.2012</w:t>
-            </w:r>
-            <w:r>
-              <w:rPr>
-                <w:rtl w:val="0"/>
-              </w:rPr>
-            </w:r>
-          </w:p>
-          <w:p>
-            <w:pPr>
-              <w:rPr/>
-            </w:pPr>
-            <w:r>
-              <w:rPr>
-                <w:sz w:val="17"/>
-                <w:szCs w:val="17"/>
-                <w:rtl w:val="0"/>
-              </w:rPr>
-              <w:t xml:space="preserve">Hoy RR, Paul RC (1973). Genetic control of song specificity in crickets. Science 180(4081):82–83. https://doi.org/10.1126/science.180.4081.82</w:t>
-            </w:r>
-            <w:r>
-              <w:rPr>
-                <w:rtl w:val="0"/>
-              </w:rPr>
-            </w:r>
-          </w:p>
-          <w:p>
-            <w:pPr>
-              <w:rPr/>
-            </w:pPr>
-            <w:r>
-              <w:rPr>
-                <w:sz w:val="17"/>
-                <w:szCs w:val="17"/>
-                <w:rtl w:val="0"/>
-              </w:rPr>
-              <w:t xml:space="preserve">Michelsen A, Popov AV, Lewis B (1994). Physics of directional hearing in the cricket Gryllus bimaculatus. Journal of Comparative Physiology A 175:153–164. https://doi.org/10.1007/BF00215111</w:t>
+              <w:t xml:space="preserve">Bok MJ, Roberts NW, Cronin TW (2018). Behavioural evidence for polychromatic ultraviolet sensitivity in mantis shrimp. Proceedings of the Royal Society B: Biological Sciences 285: 20181384. https://doi.org/10.1098/rspb.2018.1384</w:t>
+            </w:r>
+            <w:r>
+              <w:rPr>
+                <w:rtl w:val="0"/>
+              </w:rPr>
+            </w:r>
+          </w:p>
+          <w:p>
+            <w:pPr>
+              <w:rPr/>
+            </w:pPr>
+            <w:r>
+              <w:rPr>
+                <w:sz w:val="17"/>
+                <w:szCs w:val="17"/>
+                <w:rtl w:val="0"/>
+              </w:rPr>
+              <w:t xml:space="preserve">Thoen HH, How MJ, Chiou TH, Marshall J (2014). A Different Form of Color Vision in Mantis Shrimp. Science 343: 411-413. https://doi.org/10.1126/science.1245824</w:t>
+            </w:r>
+            <w:r>
+              <w:rPr>
+                <w:rtl w:val="0"/>
+              </w:rPr>
+            </w:r>
+          </w:p>
+          <w:p>
+            <w:pPr>
+              <w:rPr/>
+            </w:pPr>
+            <w:r>
+              <w:rPr>
+                <w:sz w:val="17"/>
+                <w:szCs w:val="17"/>
+                <w:rtl w:val="0"/>
+              </w:rPr>
+              <w:t xml:space="preserve">Wang CWJ, Marshall NJ (2025). Behavioural evidence of spectral opponent processing in the visual system of stomatopod crustaceans. Journal of Experimental Biology 228: jeb247952. https://doi.org/10.1242/jeb.247952</w:t>
+            </w:r>
+            <w:r>
+              <w:rPr>
+                <w:rtl w:val="0"/>
+              </w:rPr>
+            </w:r>
+          </w:p>
+          <w:p>
+            <w:pPr>
+              <w:rPr/>
+            </w:pPr>
+            <w:r>
+              <w:rPr>
+                <w:sz w:val="17"/>
+                <w:szCs w:val="17"/>
+                <w:rtl w:val="0"/>
+              </w:rPr>
+              <w:t xml:space="preserve">Kleinlogel S, White AG (2008). The Secret World of Shrimps: Polarisation Vision at Its Best. PLoS ONE 3: e2190. https://doi.org/10.1371/journal.pone.0002190</w:t>
             </w:r>
             <w:r>
               <w:rPr>
@@ -20951,7 +20954,7 @@
                 <w:szCs w:val="17"/>
                 <w:rtl w:val="0"/>
               </w:rPr>
-              <w:t xml:space="preserve">Lecture 15</w:t>
+              <w:t xml:space="preserve">Lecture 14</w:t>
             </w:r>
             <w:r>
               <w:rPr>
@@ -20979,7 +20982,7 @@
                 <w:szCs w:val="17"/>
                 <w:rtl w:val="0"/>
               </w:rPr>
-              <w:t xml:space="preserve">Insect hearing II: moth ears and bat-evasion behavior (Roeder)</w:t>
+              <w:t xml:space="preserve">Insect hearing I: cricket phonotaxis and song recognition (Hoy)</w:t>
             </w:r>
             <w:r>
               <w:rPr>
@@ -21007,61 +21010,61 @@
                 <w:szCs w:val="17"/>
                 <w:rtl w:val="0"/>
               </w:rPr>
-              <w:t xml:space="preserve">Moir HM, Jackson JC, Windmill JFC (2013). Extremely high frequency sensitivity in a ‘simple’ ear. Biology Letters 9: 20130241. https://doi.org/10.1098/rsbl.2013.0241</w:t>
-            </w:r>
-            <w:r>
-              <w:rPr>
-                <w:rtl w:val="0"/>
-              </w:rPr>
-            </w:r>
-          </w:p>
-          <w:p>
-            <w:pPr>
-              <w:rPr/>
-            </w:pPr>
-            <w:r>
-              <w:rPr>
-                <w:sz w:val="17"/>
-                <w:szCs w:val="17"/>
-                <w:rtl w:val="0"/>
-              </w:rPr>
-              <w:t xml:space="preserve">Roeder KD (1962). The behaviour of free flying moths in the presence of artificial ultrasonic pulses. Animal Behaviour 10: 300-304. https://doi.org/10.1016/0003-3472(62)90053-2</w:t>
-            </w:r>
-            <w:r>
-              <w:rPr>
-                <w:rtl w:val="0"/>
-              </w:rPr>
-            </w:r>
-          </w:p>
-          <w:p>
-            <w:pPr>
-              <w:rPr/>
-            </w:pPr>
-            <w:r>
-              <w:rPr>
-                <w:sz w:val="17"/>
-                <w:szCs w:val="17"/>
-                <w:rtl w:val="0"/>
-              </w:rPr>
-              <w:t xml:space="preserve">Corcoran AJ, Conner WE (2016). How moths escape bats: predicting outcomes of predator-prey interactions. Journal of Experimental Biology 219: 2704–2715. https://doi.org/10.1242/jeb.137638</w:t>
-            </w:r>
-            <w:r>
-              <w:rPr>
-                <w:rtl w:val="0"/>
-              </w:rPr>
-            </w:r>
-          </w:p>
-          <w:p>
-            <w:pPr>
-              <w:rPr/>
-            </w:pPr>
-            <w:r>
-              <w:rPr>
-                <w:sz w:val="17"/>
-                <w:szCs w:val="17"/>
-                <w:rtl w:val="0"/>
-              </w:rPr>
-              <w:t xml:space="preserve">Roeder KD, Treat AE (1957). Ultrasonic reception by the tympanic organ of noctuid moths. Journal of Experimental Zoology 134: 127-157. https://doi.org/10.1002/jez.1401340107</w:t>
+              <w:t xml:space="preserve">Pollack GS, Hoy RR (1979). Temporal pattern as a cue for species-specific calling song recognition in crickets. Science 204(4391):429–432. https://doi.org/10.1126/science.204.4391.429</w:t>
+            </w:r>
+            <w:r>
+              <w:rPr>
+                <w:rtl w:val="0"/>
+              </w:rPr>
+            </w:r>
+          </w:p>
+          <w:p>
+            <w:pPr>
+              <w:rPr/>
+            </w:pPr>
+            <w:r>
+              <w:rPr>
+                <w:sz w:val="17"/>
+                <w:szCs w:val="17"/>
+                <w:rtl w:val="0"/>
+              </w:rPr>
+              <w:t xml:space="preserve">Kostarakos K, Hedwig B (2012). Calling song recognition in female crickets: temporal tuning of identified brain neurons matches behavior. Journal of Neuroscience 32(28):9601–9612. https://doi.org/10.1523/JNEUROSCI.1170-12.2012</w:t>
+            </w:r>
+            <w:r>
+              <w:rPr>
+                <w:rtl w:val="0"/>
+              </w:rPr>
+            </w:r>
+          </w:p>
+          <w:p>
+            <w:pPr>
+              <w:rPr/>
+            </w:pPr>
+            <w:r>
+              <w:rPr>
+                <w:sz w:val="17"/>
+                <w:szCs w:val="17"/>
+                <w:rtl w:val="0"/>
+              </w:rPr>
+              <w:t xml:space="preserve">Hoy RR, Paul RC (1973). Genetic control of song specificity in crickets. Science 180(4081):82–83. https://doi.org/10.1126/science.180.4081.82</w:t>
+            </w:r>
+            <w:r>
+              <w:rPr>
+                <w:rtl w:val="0"/>
+              </w:rPr>
+            </w:r>
+          </w:p>
+          <w:p>
+            <w:pPr>
+              <w:rPr/>
+            </w:pPr>
+            <w:r>
+              <w:rPr>
+                <w:sz w:val="17"/>
+                <w:szCs w:val="17"/>
+                <w:rtl w:val="0"/>
+              </w:rPr>
+              <w:t xml:space="preserve">Michelsen A, Popov AV, Lewis B (1994). Physics of directional hearing in the cricket Gryllus bimaculatus. Journal of Comparative Physiology A 175:153–164. https://doi.org/10.1007/BF00215111</w:t>
             </w:r>
             <w:r>
               <w:rPr>
@@ -21123,7 +21126,7 @@
                 <w:szCs w:val="17"/>
                 <w:rtl w:val="0"/>
               </w:rPr>
-              <w:t xml:space="preserve">Lecture 16</w:t>
+              <w:t xml:space="preserve">Lecture 15</w:t>
             </w:r>
             <w:r>
               <w:rPr>
@@ -21151,7 +21154,7 @@
                 <w:szCs w:val="17"/>
                 <w:rtl w:val="0"/>
               </w:rPr>
-              <w:t xml:space="preserve">Bat echolocation I: CF-FM bats and Doppler-shift compensation (Suga)</w:t>
+              <w:t xml:space="preserve">Insect hearing II: moth ears and bat-evasion behavior (Roeder)</w:t>
             </w:r>
             <w:r>
               <w:rPr>
@@ -21179,77 +21182,61 @@
                 <w:szCs w:val="17"/>
                 <w:rtl w:val="0"/>
               </w:rPr>
-              <w:t xml:space="preserve">Schoeppler D, Schnitzler H-U, Denzinger A (2018). Precise Doppler shift compensation in the hipposiderid bat, Hipposideros armiger. Scientific Reports 8:4598. https://doi.org/10.1038/s41598-018-22880-y</w:t>
-            </w:r>
-            <w:r>
-              <w:rPr>
-                <w:rtl w:val="0"/>
-              </w:rPr>
-            </w:r>
-          </w:p>
-          <w:p>
-            <w:pPr>
-              <w:rPr/>
-            </w:pPr>
-            <w:r>
-              <w:rPr>
-                <w:sz w:val="17"/>
-                <w:szCs w:val="17"/>
-                <w:rtl w:val="0"/>
-              </w:rPr>
-              <w:t xml:space="preserve">Suga N, Simmons JA, Jen PH-S (1975). Peripheral specialization for fine analysis of Doppler-shifted echoes in the auditory system of the “CF-FM” bat Pteronotus</w:t>
-            </w:r>
-            <w:r>
-              <w:rPr>
-                <w:sz w:val="15"/>
-                <w:szCs w:val="15"/>
-                <w:rtl w:val="0"/>
-              </w:rPr>
-              <w:t xml:space="preserve"> </w:t>
-            </w:r>
-            <w:r>
-              <w:rPr>
-                <w:sz w:val="17"/>
-                <w:szCs w:val="17"/>
-                <w:rtl w:val="0"/>
-              </w:rPr>
-              <w:t xml:space="preserve">parnellii. Journal of Experimental Biology 63(1):161–192. https://doi.org/10.1242/jeb.63.1.161</w:t>
-            </w:r>
-            <w:r>
-              <w:rPr>
-                <w:rtl w:val="0"/>
-              </w:rPr>
-            </w:r>
-          </w:p>
-          <w:p>
-            <w:pPr>
-              <w:rPr/>
-            </w:pPr>
-            <w:r>
-              <w:rPr>
-                <w:sz w:val="17"/>
-                <w:szCs w:val="17"/>
-                <w:rtl w:val="0"/>
-              </w:rPr>
-              <w:t xml:space="preserve">Schuller G, Beuter K, Schnitzler H-U (1974). Response to frequency shifted artificial echoes in the bat Rhinolophus ferrumequinum. Journal of Comparative Physiology 89(3):275–286. https://doi.org/10.1007/BF00696191</w:t>
-            </w:r>
-            <w:r>
-              <w:rPr>
-                <w:rtl w:val="0"/>
-              </w:rPr>
-            </w:r>
-          </w:p>
-          <w:p>
-            <w:pPr>
-              <w:rPr/>
-            </w:pPr>
-            <w:r>
-              <w:rPr>
-                <w:sz w:val="17"/>
-                <w:szCs w:val="17"/>
-                <w:rtl w:val="0"/>
-              </w:rPr>
-              <w:t xml:space="preserve">Metzner W, Zhang S, Smotherman M (2002). Doppler-shift compensation behavior in horseshoe bats revisited: auditory feedback controls both a decrease and an increase in call frequency. Journal of Experimental Biology 205(11):1607–1616. https://doi.org/10.1242/jeb.205.11.1607</w:t>
+              <w:t xml:space="preserve">Moir HM, Jackson JC, Windmill JFC (2013). Extremely high frequency sensitivity in a ‘simple’ ear. Biology Letters 9: 20130241. https://doi.org/10.1098/rsbl.2013.0241</w:t>
+            </w:r>
+            <w:r>
+              <w:rPr>
+                <w:rtl w:val="0"/>
+              </w:rPr>
+            </w:r>
+          </w:p>
+          <w:p>
+            <w:pPr>
+              <w:rPr/>
+            </w:pPr>
+            <w:r>
+              <w:rPr>
+                <w:sz w:val="17"/>
+                <w:szCs w:val="17"/>
+                <w:rtl w:val="0"/>
+              </w:rPr>
+              <w:t xml:space="preserve">Roeder KD (1962). The behaviour of free flying moths in the presence of artificial ultrasonic pulses. Animal Behaviour 10: 300-304. https://doi.org/10.1016/0003-3472(62)90053-2</w:t>
+            </w:r>
+            <w:r>
+              <w:rPr>
+                <w:rtl w:val="0"/>
+              </w:rPr>
+            </w:r>
+          </w:p>
+          <w:p>
+            <w:pPr>
+              <w:rPr/>
+            </w:pPr>
+            <w:r>
+              <w:rPr>
+                <w:sz w:val="17"/>
+                <w:szCs w:val="17"/>
+                <w:rtl w:val="0"/>
+              </w:rPr>
+              <w:t xml:space="preserve">Corcoran AJ, Conner WE (2016). How moths escape bats: predicting outcomes of predator-prey interactions. Journal of Experimental Biology 219: 2704–2715. https://doi.org/10.1242/jeb.137638</w:t>
+            </w:r>
+            <w:r>
+              <w:rPr>
+                <w:rtl w:val="0"/>
+              </w:rPr>
+            </w:r>
+          </w:p>
+          <w:p>
+            <w:pPr>
+              <w:rPr/>
+            </w:pPr>
+            <w:r>
+              <w:rPr>
+                <w:sz w:val="17"/>
+                <w:szCs w:val="17"/>
+                <w:rtl w:val="0"/>
+              </w:rPr>
+              <w:t xml:space="preserve">Roeder KD, Treat AE (1957). Ultrasonic reception by the tympanic organ of noctuid moths. Journal of Experimental Zoology 134: 127-157. https://doi.org/10.1002/jez.1401340107</w:t>
             </w:r>
             <w:r>
               <w:rPr>
@@ -21311,7 +21298,7 @@
                 <w:szCs w:val="17"/>
                 <w:rtl w:val="0"/>
               </w:rPr>
-              <w:t xml:space="preserve">Lecture 17</w:t>
+              <w:t xml:space="preserve">Lecture 16</w:t>
             </w:r>
             <w:r>
               <w:rPr>
@@ -21339,7 +21326,7 @@
                 <w:szCs w:val="17"/>
                 <w:rtl w:val="0"/>
               </w:rPr>
-              <w:t xml:space="preserve">Bat echolocation II: FM bats, target-range computation, clutter rejection</w:t>
+              <w:t xml:space="preserve">Bat echolocation I: CF-FM bats and Doppler-shift compensation (Suga)</w:t>
             </w:r>
             <w:r>
               <w:rPr>
@@ -21367,61 +21354,77 @@
                 <w:szCs w:val="17"/>
                 <w:rtl w:val="0"/>
               </w:rPr>
-              <w:t xml:space="preserve">Bates ME, Simmons JA, Zorikov TV (2011). Bats use echo harmonic structure to distinguish their targets from background clutter. Science 333(6042):627–630. https://doi.org/10.1126/science.1202065</w:t>
-            </w:r>
-            <w:r>
-              <w:rPr>
-                <w:rtl w:val="0"/>
-              </w:rPr>
-            </w:r>
-          </w:p>
-          <w:p>
-            <w:pPr>
-              <w:rPr/>
-            </w:pPr>
-            <w:r>
-              <w:rPr>
-                <w:sz w:val="17"/>
-                <w:szCs w:val="17"/>
-                <w:rtl w:val="0"/>
-              </w:rPr>
-              <w:t xml:space="preserve">Ming C, Bates ME, Simmons JA (2020). How frequency hopping suppresses pulse-echo ambiguity in bat biosonar. Proceedings of the National Academy of Sciences 117(29):17288–17295. https://doi.org/10.1073/pnas.2001105117</w:t>
-            </w:r>
-            <w:r>
-              <w:rPr>
-                <w:rtl w:val="0"/>
-              </w:rPr>
-            </w:r>
-          </w:p>
-          <w:p>
-            <w:pPr>
-              <w:rPr/>
-            </w:pPr>
-            <w:r>
-              <w:rPr>
-                <w:sz w:val="17"/>
-                <w:szCs w:val="17"/>
-                <w:rtl w:val="0"/>
-              </w:rPr>
-              <w:t xml:space="preserve">Simmons JA (1973). The resolution of target range by echolocating bats. Journal of the Acoustical Society of America 54(1):157–173. https://doi.org/10.1121/1.1913559</w:t>
-            </w:r>
-            <w:r>
-              <w:rPr>
-                <w:rtl w:val="0"/>
-              </w:rPr>
-            </w:r>
-          </w:p>
-          <w:p>
-            <w:pPr>
-              <w:rPr/>
-            </w:pPr>
-            <w:r>
-              <w:rPr>
-                <w:sz w:val="17"/>
-                <w:szCs w:val="17"/>
-                <w:rtl w:val="0"/>
-              </w:rPr>
-              <w:t xml:space="preserve">Simmons AM, Warnecke M, Simmons JA (2024). Microseconds-level coding of echo delay in the auditory brainstem of an FM-echolocating bat. Journal of Neurophysiology 132(6):2012–2022. https://doi.org/10.1152/jn.00305.2024</w:t>
+              <w:t xml:space="preserve">Schoeppler D, Schnitzler H-U, Denzinger A (2018). Precise Doppler shift compensation in the hipposiderid bat, Hipposideros armiger. Scientific Reports 8:4598. https://doi.org/10.1038/s41598-018-22880-y</w:t>
+            </w:r>
+            <w:r>
+              <w:rPr>
+                <w:rtl w:val="0"/>
+              </w:rPr>
+            </w:r>
+          </w:p>
+          <w:p>
+            <w:pPr>
+              <w:rPr/>
+            </w:pPr>
+            <w:r>
+              <w:rPr>
+                <w:sz w:val="17"/>
+                <w:szCs w:val="17"/>
+                <w:rtl w:val="0"/>
+              </w:rPr>
+              <w:t xml:space="preserve">Suga N, Simmons JA, Jen PH-S (1975). Peripheral specialization for fine analysis of Doppler-shifted echoes in the auditory system of the “CF-FM” bat Pteronotus</w:t>
+            </w:r>
+            <w:r>
+              <w:rPr>
+                <w:sz w:val="15"/>
+                <w:szCs w:val="15"/>
+                <w:rtl w:val="0"/>
+              </w:rPr>
+              <w:t xml:space="preserve"> </w:t>
+            </w:r>
+            <w:r>
+              <w:rPr>
+                <w:sz w:val="17"/>
+                <w:szCs w:val="17"/>
+                <w:rtl w:val="0"/>
+              </w:rPr>
+              <w:t xml:space="preserve">parnellii. Journal of Experimental Biology 63(1):161–192. https://doi.org/10.1242/jeb.63.1.161</w:t>
+            </w:r>
+            <w:r>
+              <w:rPr>
+                <w:rtl w:val="0"/>
+              </w:rPr>
+            </w:r>
+          </w:p>
+          <w:p>
+            <w:pPr>
+              <w:rPr/>
+            </w:pPr>
+            <w:r>
+              <w:rPr>
+                <w:sz w:val="17"/>
+                <w:szCs w:val="17"/>
+                <w:rtl w:val="0"/>
+              </w:rPr>
+              <w:t xml:space="preserve">Schuller G, Beuter K, Schnitzler H-U (1974). Response to frequency shifted artificial echoes in the bat Rhinolophus ferrumequinum. Journal of Comparative Physiology 89(3):275–286. https://doi.org/10.1007/BF00696191</w:t>
+            </w:r>
+            <w:r>
+              <w:rPr>
+                <w:rtl w:val="0"/>
+              </w:rPr>
+            </w:r>
+          </w:p>
+          <w:p>
+            <w:pPr>
+              <w:rPr/>
+            </w:pPr>
+            <w:r>
+              <w:rPr>
+                <w:sz w:val="17"/>
+                <w:szCs w:val="17"/>
+                <w:rtl w:val="0"/>
+              </w:rPr>
+              <w:t xml:space="preserve">Metzner W, Zhang S, Smotherman M (2002). Doppler-shift compensation behavior in horseshoe bats revisited: auditory feedback controls both a decrease and an increase in call frequency. Journal of Experimental Biology 205(11):1607–1616. https://doi.org/10.1242/jeb.205.11.1607</w:t>
             </w:r>
             <w:r>
               <w:rPr>
@@ -21483,7 +21486,7 @@
                 <w:szCs w:val="17"/>
                 <w:rtl w:val="0"/>
               </w:rPr>
-              <w:t>Special Topic 1</w:t>
+              <w:t xml:space="preserve">Lecture 17</w:t>
             </w:r>
             <w:r>
               <w:rPr>
@@ -21511,7 +21514,7 @@
                 <w:szCs w:val="17"/>
                 <w:rtl w:val="0"/>
               </w:rPr>
-              <w:t>Dolphins I: anatomy/neural pathways supporting echolocation &amp; biosonar, auditory scene analysis during prey tracking and hunting strategies</w:t>
+              <w:t xml:space="preserve">Bat echolocation II: FM bats, target-range computation, clutter rejection</w:t>
             </w:r>
             <w:r>
               <w:rPr>
@@ -21539,75 +21542,61 @@
                 <w:szCs w:val="17"/>
                 <w:rtl w:val="0"/>
               </w:rPr>
-              <w:t>Cranford TW; Krysl P; Amundin M (2010). A New Acoustic Portal into the Odontocete Ear and Vibrational Analysis of the Tympanoperiotic Complex. PLoS ONE 5(8): e11927. https://doi.org/10.1371/journal.pone.0011927</w:t>
-            </w:r>
-            <w:r>
-              <w:rPr>
-                <w:rtl w:val="0"/>
-              </w:rPr>
-            </w:r>
-          </w:p>
-          <w:p>
-            <w:pPr>
-              <w:rPr/>
-            </w:pPr>
-            <w:r>
-              <w:rPr>
-                <w:sz w:val="17"/>
-                <w:szCs w:val="17"/>
-                <w:rtl w:val="0"/>
-              </w:rPr>
-              <w:t>Ladegaard M; Mulsow J; Houser DS; Jensen FH; Johnson M; Madsen PT; Finneran JJ (2019). Dolphin echolocation behaviour during active long-range target approaches. Journal of Experimental Biology 222: jeb189217. https://doi.org/10.1242/jeb.189217</w:t>
-            </w:r>
-            <w:r>
-              <w:rPr>
-                <w:sz w:val="15"/>
-                <w:szCs w:val="15"/>
-                <w:rtl w:val="0"/>
-              </w:rPr>
-            </w:r>
-            <w:r>
-              <w:rPr>
-                <w:sz w:val="17"/>
-                <w:szCs w:val="17"/>
-                <w:rtl w:val="0"/>
-              </w:rPr>
-            </w:r>
-            <w:r>
-              <w:rPr>
-                <w:rtl w:val="0"/>
-              </w:rPr>
-            </w:r>
-          </w:p>
-          <w:p>
-            <w:pPr>
-              <w:rPr/>
-            </w:pPr>
-            <w:r>
-              <w:rPr>
-                <w:sz w:val="17"/>
-                <w:szCs w:val="17"/>
-                <w:rtl w:val="0"/>
-              </w:rPr>
-              <w:t>Madsen PT; Siebert U; Elemans CPH (2023). Toothed whales use distinct vocal registers for echolocation and communication. Science 379(6635): 928-933. https://doi.org/10.1126/science.adc9570</w:t>
-            </w:r>
-            <w:r>
-              <w:rPr>
-                <w:rtl w:val="0"/>
-              </w:rPr>
-            </w:r>
-          </w:p>
-          <w:p>
-            <w:pPr>
-              <w:rPr/>
-            </w:pPr>
-            <w:r>
-              <w:rPr>
-                <w:sz w:val="17"/>
-                <w:szCs w:val="17"/>
-                <w:rtl w:val="0"/>
-              </w:rPr>
-              <w:t>Berns GS; Cook PF; Foxley S; Jbabdi S; Miller KL; Marino L (2015). Diffusion tensor imaging of dolphin brains reveals direct auditory pathway to temporal lobe. Proceedings of the Royal Society B 282(1811): 20151203. https://doi.org/10.1098/rspb.2015.1203</w:t>
+              <w:t xml:space="preserve">Bates ME, Simmons JA, Zorikov TV (2011). Bats use echo harmonic structure to distinguish their targets from background clutter. Science 333(6042):627–630. https://doi.org/10.1126/science.1202065</w:t>
+            </w:r>
+            <w:r>
+              <w:rPr>
+                <w:rtl w:val="0"/>
+              </w:rPr>
+            </w:r>
+          </w:p>
+          <w:p>
+            <w:pPr>
+              <w:rPr/>
+            </w:pPr>
+            <w:r>
+              <w:rPr>
+                <w:sz w:val="17"/>
+                <w:szCs w:val="17"/>
+                <w:rtl w:val="0"/>
+              </w:rPr>
+              <w:t xml:space="preserve">Ming C, Bates ME, Simmons JA (2020). How frequency hopping suppresses pulse-echo ambiguity in bat biosonar. Proceedings of the National Academy of Sciences 117(29):17288–17295. https://doi.org/10.1073/pnas.2001105117</w:t>
+            </w:r>
+            <w:r>
+              <w:rPr>
+                <w:rtl w:val="0"/>
+              </w:rPr>
+            </w:r>
+          </w:p>
+          <w:p>
+            <w:pPr>
+              <w:rPr/>
+            </w:pPr>
+            <w:r>
+              <w:rPr>
+                <w:sz w:val="17"/>
+                <w:szCs w:val="17"/>
+                <w:rtl w:val="0"/>
+              </w:rPr>
+              <w:t xml:space="preserve">Simmons JA (1973). The resolution of target range by echolocating bats. Journal of the Acoustical Society of America 54(1):157–173. https://doi.org/10.1121/1.1913559</w:t>
+            </w:r>
+            <w:r>
+              <w:rPr>
+                <w:rtl w:val="0"/>
+              </w:rPr>
+            </w:r>
+          </w:p>
+          <w:p>
+            <w:pPr>
+              <w:rPr/>
+            </w:pPr>
+            <w:r>
+              <w:rPr>
+                <w:sz w:val="17"/>
+                <w:szCs w:val="17"/>
+                <w:rtl w:val="0"/>
+              </w:rPr>
+              <w:t xml:space="preserve">Simmons AM, Warnecke M, Simmons JA (2024). Microseconds-level coding of echo delay in the auditory brainstem of an FM-echolocating bat. Journal of Neurophysiology 132(6):2012–2022. https://doi.org/10.1152/jn.00305.2024</w:t>
             </w:r>
             <w:r>
               <w:rPr>
@@ -22373,7 +22362,7 @@
                 <w:szCs w:val="17"/>
                 <w:rtl w:val="0"/>
               </w:rPr>
-              <w:t xml:space="preserve">Lecture 22</w:t>
+              <w:t>Special Topic 2</w:t>
             </w:r>
             <w:r>
               <w:rPr>
@@ -22401,7 +22390,7 @@
                 <w:szCs w:val="17"/>
                 <w:rtl w:val="0"/>
               </w:rPr>
-              <w:t xml:space="preserve">Electroreception III: the jamming avoidance response (Heiligenberg)</w:t>
+              <w:t>Axolotl: lateral-line sensing, electroreception, and sensory processing of courtship signals</w:t>
             </w:r>
             <w:r>
               <w:rPr>
@@ -22429,61 +22418,75 @@
                 <w:szCs w:val="17"/>
                 <w:rtl w:val="0"/>
               </w:rPr>
-              <w:t xml:space="preserve">Carr C, Heiligenberg W, Rose G (1986). A time-comparison circuit in the electric fish midbrain. I. Behavior and physiology. The Journal of Neuroscience 6(1):107-119. https://doi.org/10.1523/jneurosci.06-01-00107.1986</w:t>
-            </w:r>
-            <w:r>
-              <w:rPr>
-                <w:rtl w:val="0"/>
-              </w:rPr>
-            </w:r>
-          </w:p>
-          <w:p>
-            <w:pPr>
-              <w:rPr/>
-            </w:pPr>
-            <w:r>
-              <w:rPr>
-                <w:sz w:val="17"/>
-                <w:szCs w:val="17"/>
-                <w:rtl w:val="0"/>
-              </w:rPr>
-              <w:t xml:space="preserve">Rose G, Heiligenberg W (1985). Temporal hyperacuity in the electric sense of fish. Nature 318(6042):178-180. https://doi.org/10.1038/318178a0</w:t>
-            </w:r>
-            <w:r>
-              <w:rPr>
-                <w:rtl w:val="0"/>
-              </w:rPr>
-            </w:r>
-          </w:p>
-          <w:p>
-            <w:pPr>
-              <w:rPr/>
-            </w:pPr>
-            <w:r>
-              <w:rPr>
-                <w:sz w:val="17"/>
-                <w:szCs w:val="17"/>
-                <w:rtl w:val="0"/>
-              </w:rPr>
-              <w:t xml:space="preserve">Carr C, Maler L, Taylor B (1986). A time-comparison circuit in the electric fish midbrain. II. Functional morphology. The Journal of Neuroscience 6(5):1372-1383. https://doi.org/10.1523/jneurosci.06-05-01372.1986</w:t>
-            </w:r>
-            <w:r>
-              <w:rPr>
-                <w:rtl w:val="0"/>
-              </w:rPr>
-            </w:r>
-          </w:p>
-          <w:p>
-            <w:pPr>
-              <w:rPr/>
-            </w:pPr>
-            <w:r>
-              <w:rPr>
-                <w:sz w:val="17"/>
-                <w:szCs w:val="17"/>
-                <w:rtl w:val="0"/>
-              </w:rPr>
-              <w:t xml:space="preserve">Heiligenberg W, Rose G (1985). Phase and amplitude computations in the midbrain of an electric fish: intracellular studies of neurons participating in the jamming avoidance response of Eigenmannia. The Journal of Neuroscience 5(2):515-531. https://doi.org/10.1523/jneurosci.05-02-00515.1985</w:t>
+              <w:t>Wang Y, Pan Y, Liu X, Zhang X, Fan C, Wang J (2026). Characterization of the electrosensory receptor in axolotl and the role of voltage-gated potassium channels in electrosensitivity. Comparative Biochemistry and Physiology Part A 319:112051. https://doi.org/10.1016/j.cbpa.2026.112051</w:t>
+            </w:r>
+            <w:r>
+              <w:rPr>
+                <w:rtl w:val="0"/>
+              </w:rPr>
+            </w:r>
+          </w:p>
+          <w:p>
+            <w:pPr>
+              <w:rPr/>
+            </w:pPr>
+            <w:r>
+              <w:rPr>
+                <w:sz w:val="17"/>
+                <w:szCs w:val="17"/>
+                <w:rtl w:val="0"/>
+              </w:rPr>
+              <w:t>Münz H, Claas B, Fritzsch B (1982). Electrophysiological evidence of electroreception in the axolotl Siredon mexicanum. Neuroscience Letters 28:107–111. https://doi.org/10.1016/0304-3940(82)90216-6</w:t>
+            </w:r>
+            <w:r>
+              <w:rPr>
+                <w:sz w:val="15"/>
+                <w:szCs w:val="15"/>
+                <w:rtl w:val="0"/>
+              </w:rPr>
+            </w:r>
+            <w:r>
+              <w:rPr>
+                <w:sz w:val="17"/>
+                <w:szCs w:val="17"/>
+                <w:rtl w:val="0"/>
+              </w:rPr>
+            </w:r>
+            <w:r>
+              <w:rPr>
+                <w:rtl w:val="0"/>
+              </w:rPr>
+            </w:r>
+          </w:p>
+          <w:p>
+            <w:pPr>
+              <w:rPr/>
+            </w:pPr>
+            <w:r>
+              <w:rPr>
+                <w:sz w:val="17"/>
+                <w:szCs w:val="17"/>
+                <w:rtl w:val="0"/>
+              </w:rPr>
+              <w:t>Bartels M, Münz H, Claas B (1990). Representation of lateral line and electrosensory systems in the midbrain of the axolotl, Ambystoma mexicanum. Journal of Comparative Physiology A 167:347–356. https://doi.org/10.1007/BF00192570</w:t>
+            </w:r>
+            <w:r>
+              <w:rPr>
+                <w:rtl w:val="0"/>
+              </w:rPr>
+            </w:r>
+          </w:p>
+          <w:p>
+            <w:pPr>
+              <w:rPr/>
+            </w:pPr>
+            <w:r>
+              <w:rPr>
+                <w:sz w:val="17"/>
+                <w:szCs w:val="17"/>
+                <w:rtl w:val="0"/>
+              </w:rPr>
+              <w:t>Maex M, Van Bocxlaer I, Mortier A, Proost P, Bossuyt F (2016). Courtship Pheromone Use in a Model Urodele, the Mexican Axolotl (Ambystoma mexicanum). Scientific Reports 6:20184. https://doi.org/10.1038/srep20184</w:t>
             </w:r>
             <w:r>
               <w:rPr>
@@ -22545,7 +22548,7 @@
                 <w:szCs w:val="17"/>
                 <w:rtl w:val="0"/>
               </w:rPr>
-              <w:t>Special Topic 2</w:t>
+              <w:t xml:space="preserve">Lecture 22</w:t>
             </w:r>
             <w:r>
               <w:rPr>
@@ -22573,7 +22576,7 @@
                 <w:szCs w:val="17"/>
                 <w:rtl w:val="0"/>
               </w:rPr>
-              <w:t>Axolotl: lateral-line sensing, electroreception, and sensory processing of courtship signals</w:t>
+              <w:t xml:space="preserve">Electroreception III: the jamming avoidance response (Heiligenberg)</w:t>
             </w:r>
             <w:r>
               <w:rPr>
@@ -22601,75 +22604,61 @@
                 <w:szCs w:val="17"/>
                 <w:rtl w:val="0"/>
               </w:rPr>
-              <w:t>Wang Y, Pan Y, Liu X, Zhang X, Fan C, Wang J (2026). Characterization of the electrosensory receptor in axolotl and the role of voltage-gated potassium channels in electrosensitivity. Comparative Biochemistry and Physiology Part A 319:112051. https://doi.org/10.1016/j.cbpa.2026.112051</w:t>
-            </w:r>
-            <w:r>
-              <w:rPr>
-                <w:rtl w:val="0"/>
-              </w:rPr>
-            </w:r>
-          </w:p>
-          <w:p>
-            <w:pPr>
-              <w:rPr/>
-            </w:pPr>
-            <w:r>
-              <w:rPr>
-                <w:sz w:val="17"/>
-                <w:szCs w:val="17"/>
-                <w:rtl w:val="0"/>
-              </w:rPr>
-              <w:t>Münz H, Claas B, Fritzsch B (1982). Electrophysiological evidence of electroreception in the axolotl Siredon mexicanum. Neuroscience Letters 28:107–111. https://doi.org/10.1016/0304-3940(82)90216-6</w:t>
-            </w:r>
-            <w:r>
-              <w:rPr>
-                <w:sz w:val="15"/>
-                <w:szCs w:val="15"/>
-                <w:rtl w:val="0"/>
-              </w:rPr>
-            </w:r>
-            <w:r>
-              <w:rPr>
-                <w:sz w:val="17"/>
-                <w:szCs w:val="17"/>
-                <w:rtl w:val="0"/>
-              </w:rPr>
-            </w:r>
-            <w:r>
-              <w:rPr>
-                <w:rtl w:val="0"/>
-              </w:rPr>
-            </w:r>
-          </w:p>
-          <w:p>
-            <w:pPr>
-              <w:rPr/>
-            </w:pPr>
-            <w:r>
-              <w:rPr>
-                <w:sz w:val="17"/>
-                <w:szCs w:val="17"/>
-                <w:rtl w:val="0"/>
-              </w:rPr>
-              <w:t>Bartels M, Münz H, Claas B (1990). Representation of lateral line and electrosensory systems in the midbrain of the axolotl, Ambystoma mexicanum. Journal of Comparative Physiology A 167:347–356. https://doi.org/10.1007/BF00192570</w:t>
-            </w:r>
-            <w:r>
-              <w:rPr>
-                <w:rtl w:val="0"/>
-              </w:rPr>
-            </w:r>
-          </w:p>
-          <w:p>
-            <w:pPr>
-              <w:rPr/>
-            </w:pPr>
-            <w:r>
-              <w:rPr>
-                <w:sz w:val="17"/>
-                <w:szCs w:val="17"/>
-                <w:rtl w:val="0"/>
-              </w:rPr>
-              <w:t>Maex M, Van Bocxlaer I, Mortier A, Proost P, Bossuyt F (2016). Courtship Pheromone Use in a Model Urodele, the Mexican Axolotl (Ambystoma mexicanum). Scientific Reports 6:20184. https://doi.org/10.1038/srep20184</w:t>
+              <w:t xml:space="preserve">Carr C, Heiligenberg W, Rose G (1986). A time-comparison circuit in the electric fish midbrain. I. Behavior and physiology. The Journal of Neuroscience 6(1):107-119. https://doi.org/10.1523/jneurosci.06-01-00107.1986</w:t>
+            </w:r>
+            <w:r>
+              <w:rPr>
+                <w:rtl w:val="0"/>
+              </w:rPr>
+            </w:r>
+          </w:p>
+          <w:p>
+            <w:pPr>
+              <w:rPr/>
+            </w:pPr>
+            <w:r>
+              <w:rPr>
+                <w:sz w:val="17"/>
+                <w:szCs w:val="17"/>
+                <w:rtl w:val="0"/>
+              </w:rPr>
+              <w:t xml:space="preserve">Rose G, Heiligenberg W (1985). Temporal hyperacuity in the electric sense of fish. Nature 318(6042):178-180. https://doi.org/10.1038/318178a0</w:t>
+            </w:r>
+            <w:r>
+              <w:rPr>
+                <w:rtl w:val="0"/>
+              </w:rPr>
+            </w:r>
+          </w:p>
+          <w:p>
+            <w:pPr>
+              <w:rPr/>
+            </w:pPr>
+            <w:r>
+              <w:rPr>
+                <w:sz w:val="17"/>
+                <w:szCs w:val="17"/>
+                <w:rtl w:val="0"/>
+              </w:rPr>
+              <w:t xml:space="preserve">Carr C, Maler L, Taylor B (1986). A time-comparison circuit in the electric fish midbrain. II. Functional morphology. The Journal of Neuroscience 6(5):1372-1383. https://doi.org/10.1523/jneurosci.06-05-01372.1986</w:t>
+            </w:r>
+            <w:r>
+              <w:rPr>
+                <w:rtl w:val="0"/>
+              </w:rPr>
+            </w:r>
+          </w:p>
+          <w:p>
+            <w:pPr>
+              <w:rPr/>
+            </w:pPr>
+            <w:r>
+              <w:rPr>
+                <w:sz w:val="17"/>
+                <w:szCs w:val="17"/>
+                <w:rtl w:val="0"/>
+              </w:rPr>
+              <w:t xml:space="preserve">Heiligenberg W, Rose G (1985). Phase and amplitude computations in the midbrain of an electric fish: intracellular studies of neurons participating in the jamming avoidance response of Eigenmannia. The Journal of Neuroscience 5(2):515-531. https://doi.org/10.1523/jneurosci.05-02-00515.1985</w:t>
             </w:r>
             <w:r>
               <w:rPr>
@@ -24467,7 +24456,7 @@
                 <w:szCs w:val="17"/>
                 <w:rtl w:val="0"/>
               </w:rPr>
-              <w:t xml:space="preserve">Lecture 33</w:t>
+              <w:t>Special Topic 3</w:t>
             </w:r>
             <w:r>
               <w:rPr>
@@ -24495,7 +24484,7 @@
                 <w:szCs w:val="17"/>
                 <w:rtl w:val="0"/>
               </w:rPr>
-              <w:t xml:space="preserve">Vocal communication II: song learning, sensitive periods, and the template model (Marler &amp; Konishi)</w:t>
+              <w:t>Songbirds I: Artificial song memories, optogenetic tutoring, and neural mechanisms of vocal imitation</w:t>
             </w:r>
             <w:r>
               <w:rPr>
@@ -24523,61 +24512,75 @@
                 <w:szCs w:val="17"/>
                 <w:rtl w:val="0"/>
               </w:rPr>
-              <w:t xml:space="preserve">Marler P (1970). A comparative approach to vocal learning: Song development in white-crowned sparrows. Journal of Comparative and Physiological Psychology 71(2, Pt. 2): 1–25. https://doi.org/10.1037/h0029144</w:t>
-            </w:r>
-            <w:r>
-              <w:rPr>
-                <w:rtl w:val="0"/>
-              </w:rPr>
-            </w:r>
-          </w:p>
-          <w:p>
-            <w:pPr>
-              <w:rPr/>
-            </w:pPr>
-            <w:r>
-              <w:rPr>
-                <w:sz w:val="17"/>
-                <w:szCs w:val="17"/>
-                <w:rtl w:val="0"/>
-              </w:rPr>
-              <w:t xml:space="preserve">Brainard MS, Doupe AJ (2000). Auditory feedback in learning and maintenance of vocal behaviour. Nature Reviews Neuroscience 1: 31–40. https://doi.org/10.1038/35036205</w:t>
-            </w:r>
-            <w:r>
-              <w:rPr>
-                <w:rtl w:val="0"/>
-              </w:rPr>
-            </w:r>
-          </w:p>
-          <w:p>
-            <w:pPr>
-              <w:rPr/>
-            </w:pPr>
-            <w:r>
-              <w:rPr>
-                <w:sz w:val="17"/>
-                <w:szCs w:val="17"/>
-                <w:rtl w:val="0"/>
-              </w:rPr>
-              <w:t xml:space="preserve">Marler P, Peters S (1981). Sparrows learn adult song and more from memory. Science 213(4509): 780–782. https://doi.org/10.1126/science.213.4509.780</w:t>
-            </w:r>
-            <w:r>
-              <w:rPr>
-                <w:rtl w:val="0"/>
-              </w:rPr>
-            </w:r>
-          </w:p>
-          <w:p>
-            <w:pPr>
-              <w:rPr/>
-            </w:pPr>
-            <w:r>
-              <w:rPr>
-                <w:sz w:val="17"/>
-                <w:szCs w:val="17"/>
-                <w:rtl w:val="0"/>
-              </w:rPr>
-              <w:t xml:space="preserve">Margoliash D, Konishi M (1985). Auditory representation of autogenous song in the song system of white-crowned sparrows. Proceedings of the National Academy of Sciences USA 82(17): 5997–6000. https://doi.org/10.1073/pnas.82.17.5997</w:t>
+              <w:t>Zhao W, Garcia-Oscos F, Dinh D, Roberts TF (2019). Inception of memories that guide vocal learning in the songbird. Science 366:83–89. https://doi.org/10.1126/science.aaw4226</w:t>
+            </w:r>
+            <w:r>
+              <w:rPr>
+                <w:rtl w:val="0"/>
+              </w:rPr>
+            </w:r>
+          </w:p>
+          <w:p>
+            <w:pPr>
+              <w:rPr/>
+            </w:pPr>
+            <w:r>
+              <w:rPr>
+                <w:sz w:val="17"/>
+                <w:szCs w:val="17"/>
+                <w:rtl w:val="0"/>
+              </w:rPr>
+              <w:t>Roberts TF, Gobes SMH, Murugan M, Ölveczky BP, Mooney R (2012). Motor circuits are required to encode a sensory model for imitative learning. Nature Neuroscience 15:1454–1459. https://doi.org/10.1038/nn.3206</w:t>
+            </w:r>
+            <w:r>
+              <w:rPr>
+                <w:sz w:val="15"/>
+                <w:szCs w:val="15"/>
+                <w:rtl w:val="0"/>
+              </w:rPr>
+            </w:r>
+            <w:r>
+              <w:rPr>
+                <w:sz w:val="17"/>
+                <w:szCs w:val="17"/>
+                <w:rtl w:val="0"/>
+              </w:rPr>
+            </w:r>
+            <w:r>
+              <w:rPr>
+                <w:rtl w:val="0"/>
+              </w:rPr>
+            </w:r>
+          </w:p>
+          <w:p>
+            <w:pPr>
+              <w:rPr/>
+            </w:pPr>
+            <w:r>
+              <w:rPr>
+                <w:sz w:val="17"/>
+                <w:szCs w:val="17"/>
+                <w:rtl w:val="0"/>
+              </w:rPr>
+              <w:t>Tanaka M, Sun F, Li Y, Mooney R (2018). A mesocortical dopamine circuit enables the cultural transmission of vocal behaviour. Nature 563:117–120. https://doi.org/10.1038/s41586-018-0636-7</w:t>
+            </w:r>
+            <w:r>
+              <w:rPr>
+                <w:rtl w:val="0"/>
+              </w:rPr>
+            </w:r>
+          </w:p>
+          <w:p>
+            <w:pPr>
+              <w:rPr/>
+            </w:pPr>
+            <w:r>
+              <w:rPr>
+                <w:sz w:val="17"/>
+                <w:szCs w:val="17"/>
+                <w:rtl w:val="0"/>
+              </w:rPr>
+              <w:t>Roberts TF, Tschida KA, Klein ME, Mooney R (2010). Rapid spine stabilization and synaptic enhancement at the onset of behavioural learning. Nature 463:948–952. https://doi.org/10.1038/nature08759</w:t>
             </w:r>
             <w:r>
               <w:rPr>
@@ -24639,7 +24642,7 @@
                 <w:szCs w:val="17"/>
                 <w:rtl w:val="0"/>
               </w:rPr>
-              <w:t>Special Topic 3</w:t>
+              <w:t xml:space="preserve">Lecture 33</w:t>
             </w:r>
             <w:r>
               <w:rPr>
@@ -24667,7 +24670,7 @@
                 <w:szCs w:val="17"/>
                 <w:rtl w:val="0"/>
               </w:rPr>
-              <w:t>Songbirds I: Artificial song memories, optogenetic tutoring, and neural mechanisms of vocal imitation</w:t>
+              <w:t xml:space="preserve">Vocal communication II: song learning, sensitive periods, and the template model (Marler &amp; Konishi)</w:t>
             </w:r>
             <w:r>
               <w:rPr>
@@ -24695,75 +24698,61 @@
                 <w:szCs w:val="17"/>
                 <w:rtl w:val="0"/>
               </w:rPr>
-              <w:t>Zhao W, Garcia-Oscos F, Dinh D, Roberts TF (2019). Inception of memories that guide vocal learning in the songbird. Science 366:83–89. https://doi.org/10.1126/science.aaw4226</w:t>
-            </w:r>
-            <w:r>
-              <w:rPr>
-                <w:rtl w:val="0"/>
-              </w:rPr>
-            </w:r>
-          </w:p>
-          <w:p>
-            <w:pPr>
-              <w:rPr/>
-            </w:pPr>
-            <w:r>
-              <w:rPr>
-                <w:sz w:val="17"/>
-                <w:szCs w:val="17"/>
-                <w:rtl w:val="0"/>
-              </w:rPr>
-              <w:t>Roberts TF, Gobes SMH, Murugan M, Ölveczky BP, Mooney R (2012). Motor circuits are required to encode a sensory model for imitative learning. Nature Neuroscience 15:1454–1459. https://doi.org/10.1038/nn.3206</w:t>
-            </w:r>
-            <w:r>
-              <w:rPr>
-                <w:sz w:val="15"/>
-                <w:szCs w:val="15"/>
-                <w:rtl w:val="0"/>
-              </w:rPr>
-            </w:r>
-            <w:r>
-              <w:rPr>
-                <w:sz w:val="17"/>
-                <w:szCs w:val="17"/>
-                <w:rtl w:val="0"/>
-              </w:rPr>
-            </w:r>
-            <w:r>
-              <w:rPr>
-                <w:rtl w:val="0"/>
-              </w:rPr>
-            </w:r>
-          </w:p>
-          <w:p>
-            <w:pPr>
-              <w:rPr/>
-            </w:pPr>
-            <w:r>
-              <w:rPr>
-                <w:sz w:val="17"/>
-                <w:szCs w:val="17"/>
-                <w:rtl w:val="0"/>
-              </w:rPr>
-              <w:t>Tanaka M, Sun F, Li Y, Mooney R (2018). A mesocortical dopamine circuit enables the cultural transmission of vocal behaviour. Nature 563:117–120. https://doi.org/10.1038/s41586-018-0636-7</w:t>
-            </w:r>
-            <w:r>
-              <w:rPr>
-                <w:rtl w:val="0"/>
-              </w:rPr>
-            </w:r>
-          </w:p>
-          <w:p>
-            <w:pPr>
-              <w:rPr/>
-            </w:pPr>
-            <w:r>
-              <w:rPr>
-                <w:sz w:val="17"/>
-                <w:szCs w:val="17"/>
-                <w:rtl w:val="0"/>
-              </w:rPr>
-              <w:t>Roberts TF, Tschida KA, Klein ME, Mooney R (2010). Rapid spine stabilization and synaptic enhancement at the onset of behavioural learning. Nature 463:948–952. https://doi.org/10.1038/nature08759</w:t>
+              <w:t xml:space="preserve">Marler P (1970). A comparative approach to vocal learning: Song development in white-crowned sparrows. Journal of Comparative and Physiological Psychology 71(2, Pt. 2): 1–25. https://doi.org/10.1037/h0029144</w:t>
+            </w:r>
+            <w:r>
+              <w:rPr>
+                <w:rtl w:val="0"/>
+              </w:rPr>
+            </w:r>
+          </w:p>
+          <w:p>
+            <w:pPr>
+              <w:rPr/>
+            </w:pPr>
+            <w:r>
+              <w:rPr>
+                <w:sz w:val="17"/>
+                <w:szCs w:val="17"/>
+                <w:rtl w:val="0"/>
+              </w:rPr>
+              <w:t xml:space="preserve">Brainard MS, Doupe AJ (2000). Auditory feedback in learning and maintenance of vocal behaviour. Nature Reviews Neuroscience 1: 31–40. https://doi.org/10.1038/35036205</w:t>
+            </w:r>
+            <w:r>
+              <w:rPr>
+                <w:rtl w:val="0"/>
+              </w:rPr>
+            </w:r>
+          </w:p>
+          <w:p>
+            <w:pPr>
+              <w:rPr/>
+            </w:pPr>
+            <w:r>
+              <w:rPr>
+                <w:sz w:val="17"/>
+                <w:szCs w:val="17"/>
+                <w:rtl w:val="0"/>
+              </w:rPr>
+              <w:t xml:space="preserve">Marler P, Peters S (1981). Sparrows learn adult song and more from memory. Science 213(4509): 780–782. https://doi.org/10.1126/science.213.4509.780</w:t>
+            </w:r>
+            <w:r>
+              <w:rPr>
+                <w:rtl w:val="0"/>
+              </w:rPr>
+            </w:r>
+          </w:p>
+          <w:p>
+            <w:pPr>
+              <w:rPr/>
+            </w:pPr>
+            <w:r>
+              <w:rPr>
+                <w:sz w:val="17"/>
+                <w:szCs w:val="17"/>
+                <w:rtl w:val="0"/>
+              </w:rPr>
+              <w:t xml:space="preserve">Margoliash D, Konishi M (1985). Auditory representation of autogenous song in the song system of white-crowned sparrows. Proceedings of the National Academy of Sciences USA 82(17): 5997–6000. https://doi.org/10.1073/pnas.82.17.5997</w:t>
             </w:r>
             <w:r>
               <w:rPr>

</xml_diff>

<commit_message>
Spring 2027: special topics may appear as 2-4 questions on the next exam
Each special topic (given on an exam day) may appear as 2 to 4 questions on
the following exam, without heavy emphasis. Updated in the exam policy, the
calendar, and the website.

Co-Authored-By: Claude Opus 5.5 <noreply@anthropic.com>
Claude-Session: https://claude.ai/code/session_01S5BVrJgavhovAJWstdpyvb
</commit_message>
<xml_diff>
--- a/docs/spring-2027/files/NEUR411_Syllabus_Spring2027.docx
+++ b/docs/spring-2027/files/NEUR411_Syllabus_Spring2027.docx
@@ -4368,7 +4368,7 @@
         <w:rPr>
           <w:rtl w:val="0"/>
         </w:rPr>
-        <w:t>There are four exams, each worth 120 points, and each covers exactly ten lectures. Exam 1 covers Lectures 1 to 10, Exam 2 covers Lectures 11 to 20, Exam 3 covers Lectures 21 to 30, and Exam 4 covers Lectures 31 to 40. Exams are not cumulative, but the concepts build on one another, so later exams will assume you still know earlier material. Exams are given on Mondays at 12:00 PM in NEU 100A or NEU 100B, and they start on time. Exam 4 is given during the final examination period. On the days of Exams 1, 2, and 3, the lecture is a special topic; special topics are not covered on any exam.</w:t>
+        <w:t>There are four exams, each worth 120 points, and each covers exactly ten lectures. Exam 1 covers Lectures 1 to 10, Exam 2 covers Lectures 11 to 20, Exam 3 covers Lectures 21 to 30, and Exam 4 covers Lectures 31 to 40. Exams are not cumulative, but the concepts build on one another, so later exams will assume you still know earlier material. Exams are given on Mondays at 12:00 PM in NEU 100A or NEU 100B, and they start on time. Exam 4 is given during the final examination period. On the days of Exams 1, 2, and 3, the lecture is a special topic. Each special topic may appear as 2 to 4 questions on the next exam (Special Topic 1 on Exam 2, Special Topic 2 on Exam 3, and Special Topic 3 on Exam 4), but special topics are not a major emphasis.</w:t>
       </w:r>
     </w:p>
     <w:p>
@@ -10660,7 +10660,7 @@
                 <w:sz w:val="17"/>
                 <w:rtl w:val="0"/>
               </w:rPr>
-              <w:t>Not on the exam</w:t>
+              <w:t>2–4 questions on Exam 2</w:t>
             </w:r>
           </w:p>
         </w:tc>
@@ -12906,7 +12906,7 @@
                 <w:sz w:val="17"/>
                 <w:rtl w:val="0"/>
               </w:rPr>
-              <w:t>Not on the exam</w:t>
+              <w:t>2–4 questions on Exam 3</w:t>
             </w:r>
           </w:p>
         </w:tc>
@@ -13015,7 +13015,7 @@
                 <w:szCs w:val="17"/>
                 <w:rtl w:val="0"/>
               </w:rPr>
-              <w:t>Covers Lectures 11 to 20</w:t>
+              <w:t>Covers Lectures 11 to 20 (and 2–4 questions on Special Topic 1)</w:t>
             </w:r>
             <w:r>
               <w:rPr>
@@ -16243,7 +16243,7 @@
                 <w:sz w:val="17"/>
                 <w:rtl w:val="0"/>
               </w:rPr>
-              <w:t>Not on the exam</w:t>
+              <w:t>2–4 questions on Exam 4</w:t>
             </w:r>
           </w:p>
         </w:tc>
@@ -16352,7 +16352,7 @@
                 <w:szCs w:val="17"/>
                 <w:rtl w:val="0"/>
               </w:rPr>
-              <w:t>Covers Lectures 21 to 30</w:t>
+              <w:t>Covers Lectures 21 to 30 (and 2–4 questions on Special Topic 2)</w:t>
             </w:r>
             <w:r>
               <w:rPr>
@@ -18134,7 +18134,7 @@
                 <w:szCs w:val="17"/>
                 <w:rtl w:val="0"/>
               </w:rPr>
-              <w:t>Covers Lectures 31 to 40</w:t>
+              <w:t>Covers Lectures 31 to 40 (and 2–4 questions on Special Topic 3)</w:t>
             </w:r>
             <w:r>
               <w:rPr>

</xml_diff>